<commit_message>
updated file with new content
</commit_message>
<xml_diff>
--- a/Introduction to Streamlit & Snowflake Cortex AI/Snowflake_AI.docx
+++ b/Introduction to Streamlit & Snowflake Cortex AI/Snowflake_AI.docx
@@ -22,10 +22,9 @@
           <w:b/>
           <w:bCs/>
         </w:rPr>
-        <w:t xml:space="preserve"> What is Streamlit?</w:t>
-      </w:r>
-    </w:p>
-    <w:p>
+        <w:t xml:space="preserve"> What is </w:t>
+      </w:r>
+      <w:proofErr w:type="spellStart"/>
       <w:r>
         <w:rPr>
           <w:b/>
@@ -33,6 +32,25 @@
         </w:rPr>
         <w:t>Streamlit</w:t>
       </w:r>
+      <w:proofErr w:type="spellEnd"/>
+      <w:r>
+        <w:rPr>
+          <w:b/>
+          <w:bCs/>
+        </w:rPr>
+        <w:t>?</w:t>
+      </w:r>
+    </w:p>
+    <w:p>
+      <w:proofErr w:type="spellStart"/>
+      <w:r>
+        <w:rPr>
+          <w:b/>
+          <w:bCs/>
+        </w:rPr>
+        <w:t>Streamlit</w:t>
+      </w:r>
+      <w:proofErr w:type="spellEnd"/>
       <w:r>
         <w:t xml:space="preserve"> is a</w:t>
       </w:r>
@@ -68,7 +86,6 @@
         <w:t>You don’t need to be a web developer. If you know Python, you can build useful, beautiful data apps that run in a web browser.</w:t>
       </w:r>
     </w:p>
-    <w:p/>
     <w:p>
       <w:pPr>
         <w:rPr>
@@ -99,8 +116,13 @@
           <w:numId w:val="1"/>
         </w:numPr>
       </w:pPr>
-      <w:r>
-        <w:t>Streamlit = Python + Simplicity + Web App</w:t>
+      <w:proofErr w:type="spellStart"/>
+      <w:r>
+        <w:t>Streamlit</w:t>
+      </w:r>
+      <w:proofErr w:type="spellEnd"/>
+      <w:r>
+        <w:t xml:space="preserve"> = Python + Simplicity + Web App</w:t>
       </w:r>
     </w:p>
     <w:p>
@@ -180,7 +202,15 @@
         </w:numPr>
       </w:pPr>
       <w:r>
-        <w:t>Native support for Pandas, NumPy, Matplotlib, Plotly, and more</w:t>
+        <w:t xml:space="preserve">Native support for Pandas, NumPy, Matplotlib, </w:t>
+      </w:r>
+      <w:proofErr w:type="spellStart"/>
+      <w:r>
+        <w:t>Plotly</w:t>
+      </w:r>
+      <w:proofErr w:type="spellEnd"/>
+      <w:r>
+        <w:t>, and more</w:t>
       </w:r>
     </w:p>
     <w:p>
@@ -226,7 +256,23 @@
           <w:b/>
           <w:bCs/>
         </w:rPr>
-        <w:t xml:space="preserve"> Why Use Streamlit?</w:t>
+        <w:t xml:space="preserve"> Why Use </w:t>
+      </w:r>
+      <w:proofErr w:type="spellStart"/>
+      <w:r>
+        <w:rPr>
+          <w:b/>
+          <w:bCs/>
+        </w:rPr>
+        <w:t>Streamlit</w:t>
+      </w:r>
+      <w:proofErr w:type="spellEnd"/>
+      <w:r>
+        <w:rPr>
+          <w:b/>
+          <w:bCs/>
+        </w:rPr>
+        <w:t>?</w:t>
       </w:r>
     </w:p>
     <w:p>
@@ -268,16 +314,26 @@
       </w:r>
     </w:p>
     <w:p>
-      <w:r>
-        <w:rPr>
-          <w:b/>
-          <w:bCs/>
-        </w:rPr>
-        <w:t>Streamlit removes all that complexity</w:t>
+      <w:proofErr w:type="spellStart"/>
+      <w:r>
+        <w:rPr>
+          <w:b/>
+          <w:bCs/>
+        </w:rPr>
+        <w:t>Streamlit</w:t>
+      </w:r>
+      <w:proofErr w:type="spellEnd"/>
+      <w:r>
+        <w:rPr>
+          <w:b/>
+          <w:bCs/>
+        </w:rPr>
+        <w:t xml:space="preserve"> removes all that complexity</w:t>
       </w:r>
       <w:r>
         <w:t xml:space="preserve">. You write a Python script, add a few special </w:t>
       </w:r>
+      <w:proofErr w:type="spellStart"/>
       <w:r>
         <w:rPr>
           <w:b/>
@@ -285,9 +341,12 @@
         </w:rPr>
         <w:t>st.</w:t>
       </w:r>
+      <w:proofErr w:type="spellEnd"/>
       <w:r>
         <w:t xml:space="preserve"> commands (like </w:t>
       </w:r>
+      <w:proofErr w:type="spellStart"/>
+      <w:proofErr w:type="gramStart"/>
       <w:r>
         <w:rPr>
           <w:b/>
@@ -295,9 +354,13 @@
         </w:rPr>
         <w:t>st.write</w:t>
       </w:r>
+      <w:proofErr w:type="spellEnd"/>
+      <w:proofErr w:type="gramEnd"/>
       <w:r>
         <w:t xml:space="preserve">, </w:t>
       </w:r>
+      <w:proofErr w:type="spellStart"/>
+      <w:proofErr w:type="gramStart"/>
       <w:r>
         <w:rPr>
           <w:b/>
@@ -305,9 +368,13 @@
         </w:rPr>
         <w:t>st.button</w:t>
       </w:r>
+      <w:proofErr w:type="spellEnd"/>
+      <w:proofErr w:type="gramEnd"/>
       <w:r>
         <w:t xml:space="preserve">, </w:t>
       </w:r>
+      <w:proofErr w:type="spellStart"/>
+      <w:proofErr w:type="gramStart"/>
       <w:r>
         <w:rPr>
           <w:b/>
@@ -315,13 +382,24 @@
         </w:rPr>
         <w:t>st.slider</w:t>
       </w:r>
-      <w:r>
-        <w:t>), and Streamlit handles everything else — including the UI.</w:t>
+      <w:proofErr w:type="spellEnd"/>
+      <w:proofErr w:type="gramEnd"/>
+      <w:r>
+        <w:t xml:space="preserve">), and </w:t>
+      </w:r>
+      <w:proofErr w:type="spellStart"/>
+      <w:r>
+        <w:t>Streamlit</w:t>
+      </w:r>
+      <w:proofErr w:type="spellEnd"/>
+      <w:r>
+        <w:t xml:space="preserve"> handles everything else — including the UI.</w:t>
       </w:r>
     </w:p>
     <w:p/>
     <w:p/>
     <w:p/>
+    <w:p/>
     <w:p>
       <w:pPr>
         <w:rPr>
@@ -343,12 +421,52 @@
           <w:b/>
           <w:bCs/>
         </w:rPr>
-        <w:t xml:space="preserve"> What Can You Do With Streamlit?</w:t>
-      </w:r>
-    </w:p>
-    <w:p>
-      <w:r>
-        <w:t>Here are some things you can build with Streamlit:</w:t>
+        <w:t xml:space="preserve"> What Can You Do </w:t>
+      </w:r>
+      <w:proofErr w:type="gramStart"/>
+      <w:r>
+        <w:rPr>
+          <w:b/>
+          <w:bCs/>
+        </w:rPr>
+        <w:t>With</w:t>
+      </w:r>
+      <w:proofErr w:type="gramEnd"/>
+      <w:r>
+        <w:rPr>
+          <w:b/>
+          <w:bCs/>
+        </w:rPr>
+        <w:t xml:space="preserve"> </w:t>
+      </w:r>
+      <w:proofErr w:type="spellStart"/>
+      <w:r>
+        <w:rPr>
+          <w:b/>
+          <w:bCs/>
+        </w:rPr>
+        <w:t>Streamlit</w:t>
+      </w:r>
+      <w:proofErr w:type="spellEnd"/>
+      <w:r>
+        <w:rPr>
+          <w:b/>
+          <w:bCs/>
+        </w:rPr>
+        <w:t>?</w:t>
+      </w:r>
+    </w:p>
+    <w:p>
+      <w:r>
+        <w:t xml:space="preserve">Here are some things you can build with </w:t>
+      </w:r>
+      <w:proofErr w:type="spellStart"/>
+      <w:r>
+        <w:t>Streamlit</w:t>
+      </w:r>
+      <w:proofErr w:type="spellEnd"/>
+      <w:r>
+        <w:t>:</w:t>
       </w:r>
     </w:p>
     <w:tbl>
@@ -510,8 +628,13 @@
             <w:hideMark/>
           </w:tcPr>
           <w:p>
+            <w:proofErr w:type="spellStart"/>
             <w:r>
-              <w:t>Analyze and summarize survey or transcript data</w:t>
+              <w:t>Analyze</w:t>
+            </w:r>
+            <w:proofErr w:type="spellEnd"/>
+            <w:r>
+              <w:t xml:space="preserve"> and summarize survey or transcript data</w:t>
             </w:r>
           </w:p>
         </w:tc>
@@ -613,7 +736,23 @@
           <w:b/>
           <w:bCs/>
         </w:rPr>
-        <w:t xml:space="preserve"> Who Can Use Streamlit?</w:t>
+        <w:t xml:space="preserve"> Who Can Use </w:t>
+      </w:r>
+      <w:proofErr w:type="spellStart"/>
+      <w:r>
+        <w:rPr>
+          <w:b/>
+          <w:bCs/>
+        </w:rPr>
+        <w:t>Streamlit</w:t>
+      </w:r>
+      <w:proofErr w:type="spellEnd"/>
+      <w:r>
+        <w:rPr>
+          <w:b/>
+          <w:bCs/>
+        </w:rPr>
+        <w:t>?</w:t>
       </w:r>
     </w:p>
     <w:p>
@@ -754,8 +893,17 @@
           <w:b/>
           <w:bCs/>
         </w:rPr>
-        <w:t xml:space="preserve"> Key Features of Streamlit</w:t>
-      </w:r>
+        <w:t xml:space="preserve"> Key Features of </w:t>
+      </w:r>
+      <w:proofErr w:type="spellStart"/>
+      <w:r>
+        <w:rPr>
+          <w:b/>
+          <w:bCs/>
+        </w:rPr>
+        <w:t>Streamlit</w:t>
+      </w:r>
+      <w:proofErr w:type="spellEnd"/>
     </w:p>
     <w:tbl>
       <w:tblPr>
@@ -840,12 +988,23 @@
                 <w:bCs/>
               </w:rPr>
             </w:pPr>
+            <w:proofErr w:type="spellStart"/>
+            <w:proofErr w:type="gramStart"/>
             <w:r>
               <w:rPr>
                 <w:b/>
                 <w:bCs/>
               </w:rPr>
-              <w:t>st.write()</w:t>
+              <w:t>st.write</w:t>
+            </w:r>
+            <w:proofErr w:type="spellEnd"/>
+            <w:proofErr w:type="gramEnd"/>
+            <w:r>
+              <w:rPr>
+                <w:b/>
+                <w:bCs/>
+              </w:rPr>
+              <w:t>()</w:t>
             </w:r>
           </w:p>
         </w:tc>
@@ -879,12 +1038,73 @@
                 <w:bCs/>
               </w:rPr>
             </w:pPr>
+            <w:proofErr w:type="spellStart"/>
+            <w:proofErr w:type="gramStart"/>
             <w:r>
               <w:rPr>
                 <w:b/>
                 <w:bCs/>
               </w:rPr>
-              <w:t>st.button(), st.slider(), st.text_input()</w:t>
+              <w:t>st.button</w:t>
+            </w:r>
+            <w:proofErr w:type="spellEnd"/>
+            <w:proofErr w:type="gramEnd"/>
+            <w:r>
+              <w:rPr>
+                <w:b/>
+                <w:bCs/>
+              </w:rPr>
+              <w:t xml:space="preserve">(), </w:t>
+            </w:r>
+            <w:proofErr w:type="spellStart"/>
+            <w:proofErr w:type="gramStart"/>
+            <w:r>
+              <w:rPr>
+                <w:b/>
+                <w:bCs/>
+              </w:rPr>
+              <w:t>st.slider</w:t>
+            </w:r>
+            <w:proofErr w:type="spellEnd"/>
+            <w:proofErr w:type="gramEnd"/>
+            <w:r>
+              <w:rPr>
+                <w:b/>
+                <w:bCs/>
+              </w:rPr>
+              <w:t xml:space="preserve">(), </w:t>
+            </w:r>
+            <w:proofErr w:type="spellStart"/>
+            <w:r>
+              <w:rPr>
+                <w:b/>
+                <w:bCs/>
+              </w:rPr>
+              <w:t>st.text_</w:t>
+            </w:r>
+            <w:proofErr w:type="gramStart"/>
+            <w:r>
+              <w:rPr>
+                <w:b/>
+                <w:bCs/>
+              </w:rPr>
+              <w:t>input</w:t>
+            </w:r>
+            <w:proofErr w:type="spellEnd"/>
+            <w:r>
+              <w:rPr>
+                <w:b/>
+                <w:bCs/>
+              </w:rPr>
+              <w:t>(</w:t>
+            </w:r>
+            <w:proofErr w:type="gramEnd"/>
+            <w:r>
+              <w:rPr>
+                <w:b/>
+                <w:bCs/>
+              </w:rPr>
+              <w:t>)</w:t>
             </w:r>
           </w:p>
         </w:tc>
@@ -918,12 +1138,46 @@
                 <w:bCs/>
               </w:rPr>
             </w:pPr>
+            <w:proofErr w:type="spellStart"/>
+            <w:proofErr w:type="gramStart"/>
             <w:r>
               <w:rPr>
                 <w:b/>
                 <w:bCs/>
               </w:rPr>
-              <w:t>st.file_uploader()</w:t>
+              <w:t>st.file</w:t>
+            </w:r>
+            <w:proofErr w:type="gramEnd"/>
+            <w:r>
+              <w:rPr>
+                <w:b/>
+                <w:bCs/>
+              </w:rPr>
+              <w:t>_</w:t>
+            </w:r>
+            <w:proofErr w:type="gramStart"/>
+            <w:r>
+              <w:rPr>
+                <w:b/>
+                <w:bCs/>
+              </w:rPr>
+              <w:t>uploader</w:t>
+            </w:r>
+            <w:proofErr w:type="spellEnd"/>
+            <w:r>
+              <w:rPr>
+                <w:b/>
+                <w:bCs/>
+              </w:rPr>
+              <w:t>(</w:t>
+            </w:r>
+            <w:proofErr w:type="gramEnd"/>
+            <w:r>
+              <w:rPr>
+                <w:b/>
+                <w:bCs/>
+              </w:rPr>
+              <w:t>)</w:t>
             </w:r>
           </w:p>
         </w:tc>
@@ -957,12 +1211,23 @@
                 <w:bCs/>
               </w:rPr>
             </w:pPr>
+            <w:proofErr w:type="spellStart"/>
+            <w:proofErr w:type="gramStart"/>
             <w:r>
               <w:rPr>
                 <w:b/>
                 <w:bCs/>
               </w:rPr>
-              <w:t>st.dataframe()</w:t>
+              <w:t>st.dataframe</w:t>
+            </w:r>
+            <w:proofErr w:type="spellEnd"/>
+            <w:proofErr w:type="gramEnd"/>
+            <w:r>
+              <w:rPr>
+                <w:b/>
+                <w:bCs/>
+              </w:rPr>
+              <w:t>()</w:t>
             </w:r>
           </w:p>
         </w:tc>
@@ -974,7 +1239,15 @@
           </w:tcPr>
           <w:p>
             <w:r>
-              <w:t>Show tables and dataframes nicely</w:t>
+              <w:t xml:space="preserve">Show tables and </w:t>
+            </w:r>
+            <w:proofErr w:type="spellStart"/>
+            <w:r>
+              <w:t>dataframes</w:t>
+            </w:r>
+            <w:proofErr w:type="spellEnd"/>
+            <w:r>
+              <w:t xml:space="preserve"> nicely</w:t>
             </w:r>
           </w:p>
         </w:tc>
@@ -996,12 +1269,78 @@
                 <w:bCs/>
               </w:rPr>
             </w:pPr>
+            <w:proofErr w:type="spellStart"/>
+            <w:proofErr w:type="gramStart"/>
             <w:r>
               <w:rPr>
                 <w:b/>
                 <w:bCs/>
               </w:rPr>
-              <w:t>st.line_chart(), st.bar_chart()</w:t>
+              <w:t>st.line</w:t>
+            </w:r>
+            <w:proofErr w:type="gramEnd"/>
+            <w:r>
+              <w:rPr>
+                <w:b/>
+                <w:bCs/>
+              </w:rPr>
+              <w:t>_</w:t>
+            </w:r>
+            <w:proofErr w:type="gramStart"/>
+            <w:r>
+              <w:rPr>
+                <w:b/>
+                <w:bCs/>
+              </w:rPr>
+              <w:t>chart</w:t>
+            </w:r>
+            <w:proofErr w:type="spellEnd"/>
+            <w:r>
+              <w:rPr>
+                <w:b/>
+                <w:bCs/>
+              </w:rPr>
+              <w:t>(</w:t>
+            </w:r>
+            <w:proofErr w:type="gramEnd"/>
+            <w:r>
+              <w:rPr>
+                <w:b/>
+                <w:bCs/>
+              </w:rPr>
+              <w:t xml:space="preserve">), </w:t>
+            </w:r>
+            <w:proofErr w:type="spellStart"/>
+            <w:r>
+              <w:rPr>
+                <w:b/>
+                <w:bCs/>
+              </w:rPr>
+              <w:t>st.bar_</w:t>
+            </w:r>
+            <w:proofErr w:type="gramStart"/>
+            <w:r>
+              <w:rPr>
+                <w:b/>
+                <w:bCs/>
+              </w:rPr>
+              <w:t>chart</w:t>
+            </w:r>
+            <w:proofErr w:type="spellEnd"/>
+            <w:r>
+              <w:rPr>
+                <w:b/>
+                <w:bCs/>
+              </w:rPr>
+              <w:t>(</w:t>
+            </w:r>
+            <w:proofErr w:type="gramEnd"/>
+            <w:r>
+              <w:rPr>
+                <w:b/>
+                <w:bCs/>
+              </w:rPr>
+              <w:t>)</w:t>
             </w:r>
           </w:p>
         </w:tc>
@@ -1080,13 +1419,30 @@
           </w:tcPr>
           <w:p>
             <w:r>
-              <w:t>Easily deploy to the cloud (Streamlit Cloud or Snowflake)</w:t>
+              <w:t>Easily deploy to the cloud (</w:t>
+            </w:r>
+            <w:proofErr w:type="spellStart"/>
+            <w:r>
+              <w:t>Streamlit</w:t>
+            </w:r>
+            <w:proofErr w:type="spellEnd"/>
+            <w:r>
+              <w:t xml:space="preserve"> Cloud or Snowflake)</w:t>
             </w:r>
           </w:p>
         </w:tc>
       </w:tr>
     </w:tbl>
-    <w:p/>
+    <w:p>
+      <w:r>
+        <w:rPr>
+          <w:rFonts w:cstheme="minorHAnsi"/>
+        </w:rPr>
+        <w:pict w14:anchorId="5F979EEF">
+          <v:rect id="_x0000_i1247" style="width:0;height:1.5pt" o:hralign="center" o:hrstd="t" o:hr="t" fillcolor="#a0a0a0" stroked="f"/>
+        </w:pict>
+      </w:r>
+    </w:p>
     <w:p>
       <w:pPr>
         <w:rPr>
@@ -1101,7 +1457,25 @@
           <w:b/>
           <w:bCs/>
         </w:rPr>
-        <w:t>🧩 How Streamlit Works – A Simple Flow</w:t>
+        <w:t xml:space="preserve">🧩 How </w:t>
+      </w:r>
+      <w:proofErr w:type="spellStart"/>
+      <w:r>
+        <w:rPr>
+          <w:rFonts w:ascii="Segoe UI Emoji" w:hAnsi="Segoe UI Emoji" w:cs="Segoe UI Emoji"/>
+          <w:b/>
+          <w:bCs/>
+        </w:rPr>
+        <w:t>Streamlit</w:t>
+      </w:r>
+      <w:proofErr w:type="spellEnd"/>
+      <w:r>
+        <w:rPr>
+          <w:rFonts w:ascii="Segoe UI Emoji" w:hAnsi="Segoe UI Emoji" w:cs="Segoe UI Emoji"/>
+          <w:b/>
+          <w:bCs/>
+        </w:rPr>
+        <w:t xml:space="preserve"> Works – A Simple Flow</w:t>
       </w:r>
     </w:p>
     <w:p>
@@ -1123,24 +1497,54 @@
         </w:numPr>
       </w:pPr>
       <w:r>
-        <w:t>You use Streamlit commands (</w:t>
-      </w:r>
-      <w:r>
-        <w:rPr>
-          <w:b/>
-          <w:bCs/>
-        </w:rPr>
-        <w:t>st.write()</w:t>
+        <w:t xml:space="preserve">You use </w:t>
+      </w:r>
+      <w:proofErr w:type="spellStart"/>
+      <w:r>
+        <w:t>Streamlit</w:t>
+      </w:r>
+      <w:proofErr w:type="spellEnd"/>
+      <w:r>
+        <w:t xml:space="preserve"> commands (</w:t>
+      </w:r>
+      <w:proofErr w:type="spellStart"/>
+      <w:proofErr w:type="gramStart"/>
+      <w:r>
+        <w:rPr>
+          <w:b/>
+          <w:bCs/>
+        </w:rPr>
+        <w:t>st.write</w:t>
+      </w:r>
+      <w:proofErr w:type="spellEnd"/>
+      <w:proofErr w:type="gramEnd"/>
+      <w:r>
+        <w:rPr>
+          <w:b/>
+          <w:bCs/>
+        </w:rPr>
+        <w:t>()</w:t>
       </w:r>
       <w:r>
         <w:t xml:space="preserve">, </w:t>
       </w:r>
-      <w:r>
-        <w:rPr>
-          <w:b/>
-          <w:bCs/>
-        </w:rPr>
-        <w:t>st.button()</w:t>
+      <w:proofErr w:type="spellStart"/>
+      <w:proofErr w:type="gramStart"/>
+      <w:r>
+        <w:rPr>
+          <w:b/>
+          <w:bCs/>
+        </w:rPr>
+        <w:t>st.button</w:t>
+      </w:r>
+      <w:proofErr w:type="spellEnd"/>
+      <w:proofErr w:type="gramEnd"/>
+      <w:r>
+        <w:rPr>
+          <w:b/>
+          <w:bCs/>
+        </w:rPr>
+        <w:t>()</w:t>
       </w:r>
       <w:r>
         <w:t>, etc.)</w:t>
@@ -1156,12 +1560,21 @@
       <w:r>
         <w:t xml:space="preserve">Run the script with: </w:t>
       </w:r>
-      <w:r>
-        <w:rPr>
-          <w:b/>
-          <w:bCs/>
-        </w:rPr>
-        <w:t>streamlit run app.py</w:t>
+      <w:proofErr w:type="spellStart"/>
+      <w:r>
+        <w:rPr>
+          <w:b/>
+          <w:bCs/>
+        </w:rPr>
+        <w:t>streamlit</w:t>
+      </w:r>
+      <w:proofErr w:type="spellEnd"/>
+      <w:r>
+        <w:rPr>
+          <w:b/>
+          <w:bCs/>
+        </w:rPr>
+        <w:t xml:space="preserve"> run app.py</w:t>
       </w:r>
     </w:p>
     <w:p>
@@ -1431,7 +1844,23 @@
           <w:b/>
           <w:bCs/>
         </w:rPr>
-        <w:t xml:space="preserve"> Business Problem: Call Center Sentiment Analyzer</w:t>
+        <w:t xml:space="preserve"> Business Problem: Call </w:t>
+      </w:r>
+      <w:proofErr w:type="spellStart"/>
+      <w:r>
+        <w:rPr>
+          <w:b/>
+          <w:bCs/>
+        </w:rPr>
+        <w:t>Center</w:t>
+      </w:r>
+      <w:proofErr w:type="spellEnd"/>
+      <w:r>
+        <w:rPr>
+          <w:b/>
+          <w:bCs/>
+        </w:rPr>
+        <w:t xml:space="preserve"> Sentiment Analyzer</w:t>
       </w:r>
     </w:p>
     <w:p>
@@ -1466,7 +1895,23 @@
           <w:b/>
           <w:bCs/>
         </w:rPr>
-        <w:t>call center transcripts</w:t>
+        <w:t xml:space="preserve">call </w:t>
+      </w:r>
+      <w:proofErr w:type="spellStart"/>
+      <w:r>
+        <w:rPr>
+          <w:b/>
+          <w:bCs/>
+        </w:rPr>
+        <w:t>center</w:t>
+      </w:r>
+      <w:proofErr w:type="spellEnd"/>
+      <w:r>
+        <w:rPr>
+          <w:b/>
+          <w:bCs/>
+        </w:rPr>
+        <w:t xml:space="preserve"> transcripts</w:t>
       </w:r>
       <w:r>
         <w:t xml:space="preserve"> stored in </w:t>
@@ -1489,12 +1934,21 @@
           <w:numId w:val="5"/>
         </w:numPr>
       </w:pPr>
-      <w:r>
-        <w:rPr>
-          <w:b/>
-          <w:bCs/>
-        </w:rPr>
-        <w:t>Analyze customer sentiment</w:t>
+      <w:proofErr w:type="spellStart"/>
+      <w:r>
+        <w:rPr>
+          <w:b/>
+          <w:bCs/>
+        </w:rPr>
+        <w:t>Analyze</w:t>
+      </w:r>
+      <w:proofErr w:type="spellEnd"/>
+      <w:r>
+        <w:rPr>
+          <w:b/>
+          <w:bCs/>
+        </w:rPr>
+        <w:t xml:space="preserve"> customer sentiment</w:t>
       </w:r>
       <w:r>
         <w:t xml:space="preserve"> from these transcripts</w:t>
@@ -1533,7 +1987,23 @@
           <w:b/>
           <w:bCs/>
         </w:rPr>
-        <w:t>interactive Streamlit dashboard</w:t>
+        <w:t xml:space="preserve">interactive </w:t>
+      </w:r>
+      <w:proofErr w:type="spellStart"/>
+      <w:r>
+        <w:rPr>
+          <w:b/>
+          <w:bCs/>
+        </w:rPr>
+        <w:t>Streamlit</w:t>
+      </w:r>
+      <w:proofErr w:type="spellEnd"/>
+      <w:r>
+        <w:rPr>
+          <w:b/>
+          <w:bCs/>
+        </w:rPr>
+        <w:t xml:space="preserve"> dashboard</w:t>
       </w:r>
     </w:p>
     <w:p>
@@ -1562,12 +2032,21 @@
     <w:p>
       <w:r>
         <w:t>Help the customer support team understand customer issues better and identify areas for improvement based on conversation analytics</w:t>
+      </w:r>
+    </w:p>
+    <w:p>
+      <w:r>
+        <w:rPr>
+          <w:rFonts w:cstheme="minorHAnsi"/>
+        </w:rPr>
+        <w:pict w14:anchorId="15C0EFEC">
+          <v:rect id="_x0000_i1248" style="width:0;height:1.5pt" o:hralign="center" o:hrstd="t" o:hr="t" fillcolor="#a0a0a0" stroked="f"/>
+        </w:pict>
       </w:r>
     </w:p>
     <w:p/>
     <w:p/>
     <w:p/>
-    <w:p/>
     <w:p>
       <w:pPr>
         <w:rPr>
@@ -1582,6 +2061,654 @@
           <w:bCs/>
         </w:rPr>
         <w:lastRenderedPageBreak/>
+        <w:t>🧾</w:t>
+      </w:r>
+      <w:r>
+        <w:rPr>
+          <w:b/>
+          <w:bCs/>
+        </w:rPr>
+        <w:t xml:space="preserve"> Project Overview: Call Transcript Sentiment Analysis with Snowflake Cortex &amp; </w:t>
+      </w:r>
+      <w:proofErr w:type="spellStart"/>
+      <w:r>
+        <w:rPr>
+          <w:b/>
+          <w:bCs/>
+        </w:rPr>
+        <w:t>Streamlit</w:t>
+      </w:r>
+      <w:proofErr w:type="spellEnd"/>
+    </w:p>
+    <w:p>
+      <w:r>
+        <w:t xml:space="preserve">In today’s customer-centric businesses, </w:t>
+      </w:r>
+      <w:r>
+        <w:rPr>
+          <w:b/>
+          <w:bCs/>
+        </w:rPr>
+        <w:t>millions of customer service interactions</w:t>
+      </w:r>
+      <w:r>
+        <w:t xml:space="preserve">—including calls, emails, and chats—take place every day. </w:t>
+      </w:r>
+      <w:proofErr w:type="spellStart"/>
+      <w:r>
+        <w:t>Analyzing</w:t>
+      </w:r>
+      <w:proofErr w:type="spellEnd"/>
+      <w:r>
+        <w:t xml:space="preserve"> this vast amount of unstructured communication manually is not only time-consuming but also nearly impossible to scale. </w:t>
+      </w:r>
+      <w:r>
+        <w:rPr>
+          <w:b/>
+          <w:bCs/>
+        </w:rPr>
+        <w:t>Sentiment analysis</w:t>
+      </w:r>
+      <w:r>
+        <w:t xml:space="preserve"> helps solve this by automatically detecting the emotional tone behind each message.</w:t>
+      </w:r>
+    </w:p>
+    <w:p>
+      <w:pPr>
+        <w:rPr>
+          <w:b/>
+          <w:bCs/>
+        </w:rPr>
+      </w:pPr>
+      <w:r>
+        <w:rPr>
+          <w:rFonts w:ascii="Segoe UI Emoji" w:hAnsi="Segoe UI Emoji" w:cs="Segoe UI Emoji"/>
+          <w:b/>
+          <w:bCs/>
+        </w:rPr>
+        <w:t>🎯</w:t>
+      </w:r>
+      <w:r>
+        <w:rPr>
+          <w:b/>
+          <w:bCs/>
+        </w:rPr>
+        <w:t xml:space="preserve"> Business Problem</w:t>
+      </w:r>
+    </w:p>
+    <w:p>
+      <w:r>
+        <w:t xml:space="preserve">Imagine a large enterprise receiving </w:t>
+      </w:r>
+      <w:r>
+        <w:rPr>
+          <w:b/>
+          <w:bCs/>
+        </w:rPr>
+        <w:t>hundreds of thousands of customer complaints</w:t>
+      </w:r>
+      <w:r>
+        <w:t xml:space="preserve"> or support calls monthly. It becomes nearly impossible for teams to:</w:t>
+      </w:r>
+    </w:p>
+    <w:p>
+      <w:pPr>
+        <w:numPr>
+          <w:ilvl w:val="0"/>
+          <w:numId w:val="34"/>
+        </w:numPr>
+      </w:pPr>
+      <w:r>
+        <w:t>Review every call transcript manually</w:t>
+      </w:r>
+    </w:p>
+    <w:p>
+      <w:pPr>
+        <w:numPr>
+          <w:ilvl w:val="0"/>
+          <w:numId w:val="34"/>
+        </w:numPr>
+      </w:pPr>
+      <w:r>
+        <w:t xml:space="preserve">Identify which customers are </w:t>
+      </w:r>
+      <w:r>
+        <w:rPr>
+          <w:b/>
+          <w:bCs/>
+        </w:rPr>
+        <w:t>angry, frustrated, or at risk of churn</w:t>
+      </w:r>
+    </w:p>
+    <w:p>
+      <w:pPr>
+        <w:numPr>
+          <w:ilvl w:val="0"/>
+          <w:numId w:val="34"/>
+        </w:numPr>
+      </w:pPr>
+      <w:r>
+        <w:t>Prioritize critical complaints quickly</w:t>
+      </w:r>
+    </w:p>
+    <w:p>
+      <w:pPr>
+        <w:numPr>
+          <w:ilvl w:val="0"/>
+          <w:numId w:val="34"/>
+        </w:numPr>
+      </w:pPr>
+      <w:r>
+        <w:t>Route issues to the right department with urgency</w:t>
+      </w:r>
+    </w:p>
+    <w:p>
+      <w:r>
+        <w:t>Ignoring these signals can lead to:</w:t>
+      </w:r>
+    </w:p>
+    <w:p>
+      <w:pPr>
+        <w:numPr>
+          <w:ilvl w:val="0"/>
+          <w:numId w:val="35"/>
+        </w:numPr>
+      </w:pPr>
+      <w:r>
+        <w:t>Poor customer satisfaction</w:t>
+      </w:r>
+    </w:p>
+    <w:p>
+      <w:pPr>
+        <w:numPr>
+          <w:ilvl w:val="0"/>
+          <w:numId w:val="35"/>
+        </w:numPr>
+      </w:pPr>
+      <w:r>
+        <w:t>Brand reputation damage</w:t>
+      </w:r>
+    </w:p>
+    <w:p>
+      <w:pPr>
+        <w:numPr>
+          <w:ilvl w:val="0"/>
+          <w:numId w:val="35"/>
+        </w:numPr>
+      </w:pPr>
+      <w:r>
+        <w:t>Missed revenue recovery opportunities</w:t>
+      </w:r>
+    </w:p>
+    <w:p>
+      <w:r>
+        <w:pict w14:anchorId="6984C859">
+          <v:rect id="_x0000_i1241" style="width:0;height:1.5pt" o:hralign="center" o:hrstd="t" o:hr="t" fillcolor="#a0a0a0" stroked="f"/>
+        </w:pict>
+      </w:r>
+    </w:p>
+    <w:p>
+      <w:pPr>
+        <w:rPr>
+          <w:b/>
+          <w:bCs/>
+        </w:rPr>
+      </w:pPr>
+      <w:r>
+        <w:rPr>
+          <w:rFonts w:ascii="Segoe UI Emoji" w:hAnsi="Segoe UI Emoji" w:cs="Segoe UI Emoji"/>
+          <w:b/>
+          <w:bCs/>
+        </w:rPr>
+        <w:t>🤖</w:t>
+      </w:r>
+      <w:r>
+        <w:rPr>
+          <w:b/>
+          <w:bCs/>
+        </w:rPr>
+        <w:t xml:space="preserve"> How Snowflake Cortex AI Helps</w:t>
+      </w:r>
+    </w:p>
+    <w:p>
+      <w:r>
+        <w:t xml:space="preserve">Using </w:t>
+      </w:r>
+      <w:r>
+        <w:rPr>
+          <w:b/>
+          <w:bCs/>
+        </w:rPr>
+        <w:t>Snowflake Cortex’s AI functions</w:t>
+      </w:r>
+      <w:r>
+        <w:t xml:space="preserve"> like SENTIMENT, we can:</w:t>
+      </w:r>
+    </w:p>
+    <w:p>
+      <w:pPr>
+        <w:numPr>
+          <w:ilvl w:val="0"/>
+          <w:numId w:val="36"/>
+        </w:numPr>
+      </w:pPr>
+      <w:r>
+        <w:t xml:space="preserve">Automatically </w:t>
+      </w:r>
+      <w:proofErr w:type="spellStart"/>
+      <w:r>
+        <w:t>analyze</w:t>
+      </w:r>
+      <w:proofErr w:type="spellEnd"/>
+      <w:r>
+        <w:t xml:space="preserve"> the </w:t>
+      </w:r>
+      <w:r>
+        <w:rPr>
+          <w:b/>
+          <w:bCs/>
+        </w:rPr>
+        <w:t>sentiment</w:t>
+      </w:r>
+      <w:r>
+        <w:t xml:space="preserve"> of each customer call</w:t>
+      </w:r>
+    </w:p>
+    <w:p>
+      <w:pPr>
+        <w:numPr>
+          <w:ilvl w:val="0"/>
+          <w:numId w:val="36"/>
+        </w:numPr>
+      </w:pPr>
+      <w:r>
+        <w:t xml:space="preserve">Classify transcripts as </w:t>
+      </w:r>
+      <w:r>
+        <w:rPr>
+          <w:b/>
+          <w:bCs/>
+        </w:rPr>
+        <w:t>Positive</w:t>
+      </w:r>
+      <w:r>
+        <w:t xml:space="preserve">, </w:t>
+      </w:r>
+      <w:r>
+        <w:rPr>
+          <w:b/>
+          <w:bCs/>
+        </w:rPr>
+        <w:t>Neutral</w:t>
+      </w:r>
+      <w:r>
+        <w:t xml:space="preserve">, or </w:t>
+      </w:r>
+      <w:r>
+        <w:rPr>
+          <w:b/>
+          <w:bCs/>
+        </w:rPr>
+        <w:t>Negative</w:t>
+      </w:r>
+    </w:p>
+    <w:p>
+      <w:pPr>
+        <w:numPr>
+          <w:ilvl w:val="0"/>
+          <w:numId w:val="36"/>
+        </w:numPr>
+      </w:pPr>
+      <w:r>
+        <w:rPr>
+          <w:b/>
+          <w:bCs/>
+        </w:rPr>
+        <w:t>Summarize</w:t>
+      </w:r>
+      <w:r>
+        <w:t xml:space="preserve"> long conversations to extract key points</w:t>
+      </w:r>
+    </w:p>
+    <w:p>
+      <w:pPr>
+        <w:numPr>
+          <w:ilvl w:val="0"/>
+          <w:numId w:val="36"/>
+        </w:numPr>
+      </w:pPr>
+      <w:r>
+        <w:rPr>
+          <w:b/>
+          <w:bCs/>
+        </w:rPr>
+        <w:t>Classify</w:t>
+      </w:r>
+      <w:r>
+        <w:t xml:space="preserve"> the topic of discussion (e.g., billing, technical issue, cancellation)</w:t>
+      </w:r>
+    </w:p>
+    <w:p>
+      <w:pPr>
+        <w:numPr>
+          <w:ilvl w:val="0"/>
+          <w:numId w:val="36"/>
+        </w:numPr>
+      </w:pPr>
+      <w:r>
+        <w:rPr>
+          <w:b/>
+          <w:bCs/>
+        </w:rPr>
+        <w:t>Translate</w:t>
+      </w:r>
+      <w:r>
+        <w:t xml:space="preserve"> customer conversations if needed</w:t>
+      </w:r>
+    </w:p>
+    <w:p>
+      <w:r>
+        <w:t xml:space="preserve">This all happens </w:t>
+      </w:r>
+      <w:r>
+        <w:rPr>
+          <w:b/>
+          <w:bCs/>
+        </w:rPr>
+        <w:t>natively inside Snowflake</w:t>
+      </w:r>
+      <w:r>
+        <w:t>, without needing to move data to external ML platforms, which:</w:t>
+      </w:r>
+    </w:p>
+    <w:p>
+      <w:pPr>
+        <w:numPr>
+          <w:ilvl w:val="0"/>
+          <w:numId w:val="37"/>
+        </w:numPr>
+      </w:pPr>
+      <w:r>
+        <w:t>Speeds up processing</w:t>
+      </w:r>
+    </w:p>
+    <w:p>
+      <w:pPr>
+        <w:numPr>
+          <w:ilvl w:val="0"/>
+          <w:numId w:val="37"/>
+        </w:numPr>
+      </w:pPr>
+      <w:r>
+        <w:t>Improves data security</w:t>
+      </w:r>
+    </w:p>
+    <w:p>
+      <w:pPr>
+        <w:numPr>
+          <w:ilvl w:val="0"/>
+          <w:numId w:val="37"/>
+        </w:numPr>
+      </w:pPr>
+      <w:r>
+        <w:lastRenderedPageBreak/>
+        <w:t>Reduces engineering overhead</w:t>
+      </w:r>
+    </w:p>
+    <w:p>
+      <w:r>
+        <w:pict w14:anchorId="2606DE2B">
+          <v:rect id="_x0000_i1242" style="width:0;height:1.5pt" o:hralign="center" o:hrstd="t" o:hr="t" fillcolor="#a0a0a0" stroked="f"/>
+        </w:pict>
+      </w:r>
+    </w:p>
+    <w:p>
+      <w:pPr>
+        <w:rPr>
+          <w:b/>
+          <w:bCs/>
+        </w:rPr>
+      </w:pPr>
+      <w:r>
+        <w:rPr>
+          <w:rFonts w:ascii="Segoe UI Emoji" w:hAnsi="Segoe UI Emoji" w:cs="Segoe UI Emoji"/>
+          <w:b/>
+          <w:bCs/>
+        </w:rPr>
+        <w:t>🖥️</w:t>
+      </w:r>
+      <w:r>
+        <w:rPr>
+          <w:b/>
+          <w:bCs/>
+        </w:rPr>
+        <w:t xml:space="preserve"> </w:t>
+      </w:r>
+      <w:proofErr w:type="spellStart"/>
+      <w:r>
+        <w:rPr>
+          <w:b/>
+          <w:bCs/>
+        </w:rPr>
+        <w:t>Streamlit</w:t>
+      </w:r>
+      <w:proofErr w:type="spellEnd"/>
+      <w:r>
+        <w:rPr>
+          <w:b/>
+          <w:bCs/>
+        </w:rPr>
+        <w:t xml:space="preserve"> for Interactive Apps</w:t>
+      </w:r>
+    </w:p>
+    <w:p>
+      <w:r>
+        <w:t xml:space="preserve">We use </w:t>
+      </w:r>
+      <w:proofErr w:type="spellStart"/>
+      <w:r>
+        <w:rPr>
+          <w:b/>
+          <w:bCs/>
+        </w:rPr>
+        <w:t>Streamlit</w:t>
+      </w:r>
+      <w:proofErr w:type="spellEnd"/>
+      <w:r>
+        <w:rPr>
+          <w:b/>
+          <w:bCs/>
+        </w:rPr>
+        <w:t xml:space="preserve"> inside Snowflake</w:t>
+      </w:r>
+      <w:r>
+        <w:t xml:space="preserve"> to build an easy-to-use dashboard for analysts or support managers. With a few clicks, they can:</w:t>
+      </w:r>
+    </w:p>
+    <w:p>
+      <w:pPr>
+        <w:numPr>
+          <w:ilvl w:val="0"/>
+          <w:numId w:val="38"/>
+        </w:numPr>
+      </w:pPr>
+      <w:r>
+        <w:t>Select a call from a list</w:t>
+      </w:r>
+    </w:p>
+    <w:p>
+      <w:pPr>
+        <w:numPr>
+          <w:ilvl w:val="0"/>
+          <w:numId w:val="38"/>
+        </w:numPr>
+      </w:pPr>
+      <w:r>
+        <w:t>Instantly see the sentiment and topic</w:t>
+      </w:r>
+    </w:p>
+    <w:p>
+      <w:pPr>
+        <w:numPr>
+          <w:ilvl w:val="0"/>
+          <w:numId w:val="38"/>
+        </w:numPr>
+      </w:pPr>
+      <w:r>
+        <w:t>Read an AI-generated summary</w:t>
+      </w:r>
+    </w:p>
+    <w:p>
+      <w:pPr>
+        <w:numPr>
+          <w:ilvl w:val="0"/>
+          <w:numId w:val="38"/>
+        </w:numPr>
+      </w:pPr>
+      <w:r>
+        <w:t>Take immediate action based on insights</w:t>
+      </w:r>
+    </w:p>
+    <w:p>
+      <w:r>
+        <w:pict w14:anchorId="7085D74F">
+          <v:rect id="_x0000_i1243" style="width:0;height:1.5pt" o:hralign="center" o:hrstd="t" o:hr="t" fillcolor="#a0a0a0" stroked="f"/>
+        </w:pict>
+      </w:r>
+    </w:p>
+    <w:p>
+      <w:pPr>
+        <w:rPr>
+          <w:b/>
+          <w:bCs/>
+        </w:rPr>
+      </w:pPr>
+      <w:r>
+        <w:rPr>
+          <w:rFonts w:ascii="Segoe UI Emoji" w:hAnsi="Segoe UI Emoji" w:cs="Segoe UI Emoji"/>
+          <w:b/>
+          <w:bCs/>
+        </w:rPr>
+        <w:t>💡</w:t>
+      </w:r>
+      <w:r>
+        <w:rPr>
+          <w:b/>
+          <w:bCs/>
+        </w:rPr>
+        <w:t xml:space="preserve"> Real-World Impact</w:t>
+      </w:r>
+    </w:p>
+    <w:p>
+      <w:r>
+        <w:t xml:space="preserve">This kind of automation is a </w:t>
+      </w:r>
+      <w:r>
+        <w:rPr>
+          <w:b/>
+          <w:bCs/>
+        </w:rPr>
+        <w:t>game-changer</w:t>
+      </w:r>
+      <w:r>
+        <w:t xml:space="preserve"> for industries like:</w:t>
+      </w:r>
+    </w:p>
+    <w:p>
+      <w:pPr>
+        <w:numPr>
+          <w:ilvl w:val="0"/>
+          <w:numId w:val="39"/>
+        </w:numPr>
+      </w:pPr>
+      <w:r>
+        <w:rPr>
+          <w:b/>
+          <w:bCs/>
+        </w:rPr>
+        <w:t>Telecom</w:t>
+      </w:r>
+      <w:r>
+        <w:t>: Monitoring customer satisfaction at scale</w:t>
+      </w:r>
+    </w:p>
+    <w:p>
+      <w:pPr>
+        <w:numPr>
+          <w:ilvl w:val="0"/>
+          <w:numId w:val="39"/>
+        </w:numPr>
+      </w:pPr>
+      <w:r>
+        <w:rPr>
+          <w:b/>
+          <w:bCs/>
+        </w:rPr>
+        <w:t>E-commerce</w:t>
+      </w:r>
+      <w:r>
+        <w:t>: Detecting unhappy customers before they churn</w:t>
+      </w:r>
+    </w:p>
+    <w:p>
+      <w:pPr>
+        <w:numPr>
+          <w:ilvl w:val="0"/>
+          <w:numId w:val="39"/>
+        </w:numPr>
+      </w:pPr>
+      <w:r>
+        <w:rPr>
+          <w:b/>
+          <w:bCs/>
+        </w:rPr>
+        <w:t>Banking/Insurance</w:t>
+      </w:r>
+      <w:r>
+        <w:t>: Flagging high-risk conversations for compliance</w:t>
+      </w:r>
+    </w:p>
+    <w:p>
+      <w:pPr>
+        <w:numPr>
+          <w:ilvl w:val="0"/>
+          <w:numId w:val="39"/>
+        </w:numPr>
+      </w:pPr>
+      <w:r>
+        <w:rPr>
+          <w:b/>
+          <w:bCs/>
+        </w:rPr>
+        <w:t>Tech Support</w:t>
+      </w:r>
+      <w:r>
+        <w:t>: Prioritizing negative feedback for faster resolution</w:t>
+      </w:r>
+    </w:p>
+    <w:p>
+      <w:r>
+        <w:rPr>
+          <w:rFonts w:cstheme="minorHAnsi"/>
+        </w:rPr>
+        <w:pict w14:anchorId="767540F7">
+          <v:rect id="_x0000_i1249" style="width:0;height:1.5pt" o:hralign="center" o:hrstd="t" o:hr="t" fillcolor="#a0a0a0" stroked="f"/>
+        </w:pict>
+      </w:r>
+    </w:p>
+    <w:p>
+      <w:pPr>
+        <w:rPr>
+          <w:b/>
+          <w:bCs/>
+        </w:rPr>
+      </w:pPr>
+      <w:r>
+        <w:rPr>
+          <w:rFonts w:ascii="Segoe UI Emoji" w:hAnsi="Segoe UI Emoji" w:cs="Segoe UI Emoji"/>
+          <w:b/>
+          <w:bCs/>
+        </w:rPr>
         <w:t>🔹</w:t>
       </w:r>
       <w:r>
@@ -1693,8 +2820,18 @@
           <w:b/>
           <w:bCs/>
         </w:rPr>
-        <w:t>Load the datasets :</w:t>
-      </w:r>
+        <w:lastRenderedPageBreak/>
+        <w:t xml:space="preserve">Load the </w:t>
+      </w:r>
+      <w:proofErr w:type="gramStart"/>
+      <w:r>
+        <w:rPr>
+          <w:b/>
+          <w:bCs/>
+        </w:rPr>
+        <w:t>datasets :</w:t>
+      </w:r>
+      <w:proofErr w:type="gramEnd"/>
       <w:r>
         <w:t xml:space="preserve"> </w:t>
       </w:r>
@@ -1784,7 +2921,23 @@
           <w:b/>
           <w:bCs/>
         </w:rPr>
-        <w:t>2. Streamlit App Plan:</w:t>
+        <w:t xml:space="preserve">2. </w:t>
+      </w:r>
+      <w:proofErr w:type="spellStart"/>
+      <w:r>
+        <w:rPr>
+          <w:b/>
+          <w:bCs/>
+        </w:rPr>
+        <w:t>Streamlit</w:t>
+      </w:r>
+      <w:proofErr w:type="spellEnd"/>
+      <w:r>
+        <w:rPr>
+          <w:b/>
+          <w:bCs/>
+        </w:rPr>
+        <w:t xml:space="preserve"> App Plan:</w:t>
       </w:r>
     </w:p>
     <w:p>
@@ -1840,7 +2993,15 @@
         </w:numPr>
       </w:pPr>
       <w:r>
-        <w:t>Button to analyze sentiment + summarize using Snowflake Cortex or OpenAI</w:t>
+        <w:t xml:space="preserve">Button to </w:t>
+      </w:r>
+      <w:proofErr w:type="spellStart"/>
+      <w:r>
+        <w:t>analyze</w:t>
+      </w:r>
+      <w:proofErr w:type="spellEnd"/>
+      <w:r>
+        <w:t xml:space="preserve"> sentiment + summarize using Snowflake Cortex or OpenAI</w:t>
       </w:r>
     </w:p>
     <w:p>
@@ -1889,7 +3050,6 @@
         </w:pict>
       </w:r>
     </w:p>
-    <w:p/>
     <w:p>
       <w:pPr>
         <w:rPr>
@@ -1993,7 +3153,16 @@
     </w:p>
     <w:p>
       <w:r>
-        <w:t xml:space="preserve">In our Streamlit app, we used several AI-powered functions provided by </w:t>
+        <w:lastRenderedPageBreak/>
+        <w:t xml:space="preserve">In our </w:t>
+      </w:r>
+      <w:proofErr w:type="spellStart"/>
+      <w:r>
+        <w:t>Streamlit</w:t>
+      </w:r>
+      <w:proofErr w:type="spellEnd"/>
+      <w:r>
+        <w:t xml:space="preserve"> app, we used several AI-powered functions provided by </w:t>
       </w:r>
       <w:r>
         <w:rPr>
@@ -2019,7 +3188,16 @@
           <w:bCs/>
           <w:highlight w:val="yellow"/>
         </w:rPr>
-        <w:t>1️</w:t>
+        <w:t>1</w:t>
+      </w:r>
+      <w:proofErr w:type="gramStart"/>
+      <w:r>
+        <w:rPr>
+          <w:b/>
+          <w:bCs/>
+          <w:highlight w:val="yellow"/>
+        </w:rPr>
+        <w:t>️</w:t>
       </w:r>
       <w:r>
         <w:rPr>
@@ -2036,7 +3214,34 @@
           <w:bCs/>
           <w:highlight w:val="yellow"/>
         </w:rPr>
-        <w:t>SNOWFLAKE.CORTEX.SUMMARIZE()</w:t>
+        <w:t>SNOWFLAKE.CORTEX</w:t>
+      </w:r>
+      <w:proofErr w:type="gramEnd"/>
+      <w:r>
+        <w:rPr>
+          <w:b/>
+          <w:bCs/>
+          <w:highlight w:val="yellow"/>
+        </w:rPr>
+        <w:t>.</w:t>
+      </w:r>
+      <w:proofErr w:type="gramStart"/>
+      <w:r>
+        <w:rPr>
+          <w:b/>
+          <w:bCs/>
+          <w:highlight w:val="yellow"/>
+        </w:rPr>
+        <w:t>SUMMARIZE(</w:t>
+      </w:r>
+      <w:proofErr w:type="gramEnd"/>
+      <w:r>
+        <w:rPr>
+          <w:b/>
+          <w:bCs/>
+          <w:highlight w:val="yellow"/>
+        </w:rPr>
+        <w:t>)</w:t>
       </w:r>
     </w:p>
     <w:p>
@@ -2140,6 +3345,7 @@
       <w:r>
         <w:t xml:space="preserve">SELECT </w:t>
       </w:r>
+      <w:proofErr w:type="gramStart"/>
       <w:r>
         <w:rPr>
           <w:b/>
@@ -2147,6 +3353,7 @@
         </w:rPr>
         <w:t>SNOWFLAKE.CORTEX.SUMMARIZE</w:t>
       </w:r>
+      <w:proofErr w:type="gramEnd"/>
       <w:r>
         <w:t>('Customer called to report login issues...') AS summary;</w:t>
       </w:r>
@@ -2414,6 +3621,7 @@
         <w:rPr>
           <w:noProof/>
         </w:rPr>
+        <w:lastRenderedPageBreak/>
         <w:drawing>
           <wp:inline distT="0" distB="0" distL="0" distR="0" wp14:anchorId="682104C0" wp14:editId="55C03A67">
             <wp:extent cx="4141528" cy="1491175"/>
@@ -2475,13 +3683,23 @@
         </w:rPr>
         <w:t xml:space="preserve">. </w:t>
       </w:r>
+      <w:proofErr w:type="gramStart"/>
       <w:r>
         <w:rPr>
           <w:b/>
           <w:bCs/>
           <w:highlight w:val="yellow"/>
         </w:rPr>
-        <w:t>SNOWFLAKE.CORTEX.SENTIMENT()</w:t>
+        <w:t>SNOWFLAKE.CORTEX.SENTIMENT</w:t>
+      </w:r>
+      <w:proofErr w:type="gramEnd"/>
+      <w:r>
+        <w:rPr>
+          <w:b/>
+          <w:bCs/>
+          <w:highlight w:val="yellow"/>
+        </w:rPr>
+        <w:t>()</w:t>
       </w:r>
     </w:p>
     <w:p>
@@ -2607,6 +3825,7 @@
       <w:r>
         <w:t xml:space="preserve">SELECT </w:t>
       </w:r>
+      <w:proofErr w:type="gramStart"/>
       <w:r>
         <w:rPr>
           <w:b/>
@@ -2614,6 +3833,7 @@
         </w:rPr>
         <w:t>SNOWFLAKE.CORTEX.SENTIMENT</w:t>
       </w:r>
+      <w:proofErr w:type="gramEnd"/>
       <w:r>
         <w:t>('I am very disappointed with your service') AS sentiment;</w:t>
       </w:r>
@@ -2646,11 +3866,10 @@
           <w:bCs/>
           <w:noProof/>
         </w:rPr>
-        <w:lastRenderedPageBreak/>
         <w:drawing>
-          <wp:inline distT="0" distB="0" distL="0" distR="0" wp14:anchorId="070D8E13" wp14:editId="31AEDBCF">
-            <wp:extent cx="5731510" cy="2708275"/>
-            <wp:effectExtent l="0" t="0" r="2540" b="0"/>
+          <wp:inline distT="0" distB="0" distL="0" distR="0" wp14:anchorId="070D8E13" wp14:editId="6DEE921F">
+            <wp:extent cx="6006999" cy="2838450"/>
+            <wp:effectExtent l="0" t="0" r="0" b="0"/>
             <wp:docPr id="932737989" name="Picture 1"/>
             <wp:cNvGraphicFramePr>
               <a:graphicFrameLocks xmlns:a="http://schemas.openxmlformats.org/drawingml/2006/main" noChangeAspect="1"/>
@@ -2671,7 +3890,7 @@
                   <pic:spPr>
                     <a:xfrm>
                       <a:off x="0" y="0"/>
-                      <a:ext cx="5731510" cy="2708275"/>
+                      <a:ext cx="6010458" cy="2840085"/>
                     </a:xfrm>
                     <a:prstGeom prst="rect">
                       <a:avLst/>
@@ -2689,14 +3908,42 @@
         <w:rPr>
           <w:b/>
           <w:bCs/>
-        </w:rPr>
-      </w:pPr>
-      <w:r>
-        <w:rPr>
-          <w:b/>
-          <w:bCs/>
           <w:highlight w:val="yellow"/>
         </w:rPr>
+      </w:pPr>
+    </w:p>
+    <w:p>
+      <w:pPr>
+        <w:rPr>
+          <w:b/>
+          <w:bCs/>
+          <w:highlight w:val="yellow"/>
+        </w:rPr>
+      </w:pPr>
+    </w:p>
+    <w:p>
+      <w:pPr>
+        <w:rPr>
+          <w:b/>
+          <w:bCs/>
+          <w:highlight w:val="yellow"/>
+        </w:rPr>
+      </w:pPr>
+    </w:p>
+    <w:p>
+      <w:pPr>
+        <w:rPr>
+          <w:b/>
+          <w:bCs/>
+        </w:rPr>
+      </w:pPr>
+      <w:r>
+        <w:rPr>
+          <w:b/>
+          <w:bCs/>
+          <w:highlight w:val="yellow"/>
+        </w:rPr>
+        <w:lastRenderedPageBreak/>
         <w:t>3️</w:t>
       </w:r>
       <w:r>
@@ -2708,13 +3955,41 @@
         </w:rPr>
         <w:t xml:space="preserve">. </w:t>
       </w:r>
+      <w:proofErr w:type="gramStart"/>
       <w:r>
         <w:rPr>
           <w:b/>
           <w:bCs/>
           <w:highlight w:val="yellow"/>
         </w:rPr>
-        <w:t>SNOWFLAKE.CORTEX.CLASSIFY_TEXT()</w:t>
+        <w:t>SNOWFLAKE.CORTEX.CLASSIFY</w:t>
+      </w:r>
+      <w:proofErr w:type="gramEnd"/>
+      <w:r>
+        <w:rPr>
+          <w:b/>
+          <w:bCs/>
+          <w:highlight w:val="yellow"/>
+        </w:rPr>
+        <w:t>_</w:t>
+      </w:r>
+      <w:proofErr w:type="gramStart"/>
+      <w:r>
+        <w:rPr>
+          <w:b/>
+          <w:bCs/>
+          <w:highlight w:val="yellow"/>
+        </w:rPr>
+        <w:t>TEXT(</w:t>
+      </w:r>
+      <w:proofErr w:type="gramEnd"/>
+      <w:r>
+        <w:rPr>
+          <w:b/>
+          <w:bCs/>
+          <w:highlight w:val="yellow"/>
+        </w:rPr>
+        <w:t>)</w:t>
       </w:r>
     </w:p>
     <w:p>
@@ -2800,8 +4075,13 @@
         </w:numPr>
       </w:pPr>
       <w:r>
-        <w:t>Automates customer routing in support centers</w:t>
-      </w:r>
+        <w:t xml:space="preserve">Automates customer routing in support </w:t>
+      </w:r>
+      <w:proofErr w:type="spellStart"/>
+      <w:r>
+        <w:t>centers</w:t>
+      </w:r>
+      <w:proofErr w:type="spellEnd"/>
     </w:p>
     <w:p>
       <w:pPr>
@@ -2841,15 +4121,36 @@
       <w:r>
         <w:t xml:space="preserve">SELECT </w:t>
       </w:r>
-      <w:r>
-        <w:rPr>
-          <w:b/>
-          <w:bCs/>
-        </w:rPr>
-        <w:t>SNOWFLAKE.CORTEX.CLASSIFY_TEXT</w:t>
-      </w:r>
-      <w:r>
-        <w:t>( 'I forgot my password and can’t log in.',</w:t>
+      <w:proofErr w:type="gramStart"/>
+      <w:r>
+        <w:rPr>
+          <w:b/>
+          <w:bCs/>
+        </w:rPr>
+        <w:t>SNOWFLAKE.CORTEX.CLASSIFY</w:t>
+      </w:r>
+      <w:proofErr w:type="gramEnd"/>
+      <w:r>
+        <w:rPr>
+          <w:b/>
+          <w:bCs/>
+        </w:rPr>
+        <w:t>_</w:t>
+      </w:r>
+      <w:proofErr w:type="gramStart"/>
+      <w:r>
+        <w:rPr>
+          <w:b/>
+          <w:bCs/>
+        </w:rPr>
+        <w:t>TEXT</w:t>
+      </w:r>
+      <w:r>
+        <w:t>( '</w:t>
+      </w:r>
+      <w:proofErr w:type="gramEnd"/>
+      <w:r>
+        <w:t>I forgot my password and can’t log in.',</w:t>
       </w:r>
     </w:p>
     <w:p>
@@ -2861,10 +4162,22 @@
           <w:b/>
           <w:bCs/>
         </w:rPr>
-        <w:t>ARRAY_CONSTRUCT</w:t>
-      </w:r>
-      <w:r>
-        <w:t xml:space="preserve">('Billing', 'Technical Support', 'Account Access')) AS </w:t>
+        <w:t>ARRAY_</w:t>
+      </w:r>
+      <w:proofErr w:type="gramStart"/>
+      <w:r>
+        <w:rPr>
+          <w:b/>
+          <w:bCs/>
+        </w:rPr>
+        <w:t>CONSTRUCT</w:t>
+      </w:r>
+      <w:r>
+        <w:t>(</w:t>
+      </w:r>
+      <w:proofErr w:type="gramEnd"/>
+      <w:r>
+        <w:t xml:space="preserve">'Billing', 'Technical Support', 'Account Access')) AS </w:t>
       </w:r>
       <w:r>
         <w:rPr>
@@ -2924,7 +4237,6 @@
         <w:rPr>
           <w:noProof/>
         </w:rPr>
-        <w:lastRenderedPageBreak/>
         <w:drawing>
           <wp:inline distT="0" distB="0" distL="0" distR="0" wp14:anchorId="30002B20" wp14:editId="0CA5477C">
             <wp:extent cx="6266717" cy="2799471"/>
@@ -2975,7 +4287,17 @@
           <w:bCs/>
           <w:highlight w:val="yellow"/>
         </w:rPr>
-        <w:t>4️</w:t>
+        <w:lastRenderedPageBreak/>
+        <w:t>4</w:t>
+      </w:r>
+      <w:proofErr w:type="gramStart"/>
+      <w:r>
+        <w:rPr>
+          <w:b/>
+          <w:bCs/>
+          <w:highlight w:val="yellow"/>
+        </w:rPr>
+        <w:t>️</w:t>
       </w:r>
       <w:r>
         <w:rPr>
@@ -2992,7 +4314,34 @@
           <w:bCs/>
           <w:highlight w:val="yellow"/>
         </w:rPr>
-        <w:t>SNOWFLAKE.CORTEX.TRANSLATE()</w:t>
+        <w:t>SNOWFLAKE.CORTEX</w:t>
+      </w:r>
+      <w:proofErr w:type="gramEnd"/>
+      <w:r>
+        <w:rPr>
+          <w:b/>
+          <w:bCs/>
+          <w:highlight w:val="yellow"/>
+        </w:rPr>
+        <w:t>.</w:t>
+      </w:r>
+      <w:proofErr w:type="gramStart"/>
+      <w:r>
+        <w:rPr>
+          <w:b/>
+          <w:bCs/>
+          <w:highlight w:val="yellow"/>
+        </w:rPr>
+        <w:t>TRANSLATE(</w:t>
+      </w:r>
+      <w:proofErr w:type="gramEnd"/>
+      <w:r>
+        <w:rPr>
+          <w:b/>
+          <w:bCs/>
+          <w:highlight w:val="yellow"/>
+        </w:rPr>
+        <w:t>)</w:t>
       </w:r>
     </w:p>
     <w:p>
@@ -3066,8 +4415,15 @@
           <w:numId w:val="19"/>
         </w:numPr>
       </w:pPr>
-      <w:r>
-        <w:t>Lets companies handle customer messages in different languages and convert them into one standard language (e.g., English) for easier processing.</w:t>
+      <w:proofErr w:type="spellStart"/>
+      <w:proofErr w:type="gramStart"/>
+      <w:r>
+        <w:t>Lets</w:t>
+      </w:r>
+      <w:proofErr w:type="spellEnd"/>
+      <w:proofErr w:type="gramEnd"/>
+      <w:r>
+        <w:t xml:space="preserve"> companies handle customer messages in different languages and convert them into one standard language (e.g., English) for easier processing.</w:t>
       </w:r>
     </w:p>
     <w:p>
@@ -3117,7 +4473,23 @@
           <w:b/>
           <w:bCs/>
         </w:rPr>
-        <w:t>'en'</w:t>
+        <w:t>'</w:t>
+      </w:r>
+      <w:proofErr w:type="spellStart"/>
+      <w:r>
+        <w:rPr>
+          <w:b/>
+          <w:bCs/>
+        </w:rPr>
+        <w:t>en</w:t>
+      </w:r>
+      <w:proofErr w:type="spellEnd"/>
+      <w:r>
+        <w:rPr>
+          <w:b/>
+          <w:bCs/>
+        </w:rPr>
+        <w:t>'</w:t>
       </w:r>
       <w:r>
         <w:t>)</w:t>
@@ -3133,7 +4505,23 @@
           <w:b/>
           <w:bCs/>
         </w:rPr>
-        <w:t>'fr'</w:t>
+        <w:t>'</w:t>
+      </w:r>
+      <w:proofErr w:type="spellStart"/>
+      <w:r>
+        <w:rPr>
+          <w:b/>
+          <w:bCs/>
+        </w:rPr>
+        <w:t>fr</w:t>
+      </w:r>
+      <w:proofErr w:type="spellEnd"/>
+      <w:r>
+        <w:rPr>
+          <w:b/>
+          <w:bCs/>
+        </w:rPr>
+        <w:t>'</w:t>
       </w:r>
       <w:r>
         <w:t>)</w:t>
@@ -3197,7 +4585,23 @@
           <w:b/>
           <w:bCs/>
         </w:rPr>
-        <w:t>'zh'</w:t>
+        <w:t>'</w:t>
+      </w:r>
+      <w:proofErr w:type="spellStart"/>
+      <w:r>
+        <w:rPr>
+          <w:b/>
+          <w:bCs/>
+        </w:rPr>
+        <w:t>zh</w:t>
+      </w:r>
+      <w:proofErr w:type="spellEnd"/>
+      <w:r>
+        <w:rPr>
+          <w:b/>
+          <w:bCs/>
+        </w:rPr>
+        <w:t>'</w:t>
       </w:r>
       <w:r>
         <w:t>)</w:t>
@@ -3213,7 +4617,23 @@
           <w:b/>
           <w:bCs/>
         </w:rPr>
-        <w:t>'ja'</w:t>
+        <w:t>'</w:t>
+      </w:r>
+      <w:proofErr w:type="spellStart"/>
+      <w:r>
+        <w:rPr>
+          <w:b/>
+          <w:bCs/>
+        </w:rPr>
+        <w:t>ja</w:t>
+      </w:r>
+      <w:proofErr w:type="spellEnd"/>
+      <w:r>
+        <w:rPr>
+          <w:b/>
+          <w:bCs/>
+        </w:rPr>
+        <w:t>'</w:t>
       </w:r>
       <w:r>
         <w:t>)</w:t>
@@ -3269,6 +4689,7 @@
       <w:r>
         <w:t xml:space="preserve">SELECT </w:t>
       </w:r>
+      <w:proofErr w:type="gramStart"/>
       <w:r>
         <w:rPr>
           <w:b/>
@@ -3297,8 +4718,45 @@
         <w:t>TRANSLATE</w:t>
       </w:r>
       <w:r>
-        <w:t>( 'Je ne peux pas accéder à mon compte.','</w:t>
-      </w:r>
+        <w:t>( '</w:t>
+      </w:r>
+      <w:proofErr w:type="gramEnd"/>
+      <w:r>
+        <w:t xml:space="preserve">Je ne </w:t>
+      </w:r>
+      <w:proofErr w:type="spellStart"/>
+      <w:r>
+        <w:t>peux</w:t>
+      </w:r>
+      <w:proofErr w:type="spellEnd"/>
+      <w:r>
+        <w:t xml:space="preserve"> pas </w:t>
+      </w:r>
+      <w:proofErr w:type="spellStart"/>
+      <w:r>
+        <w:t>accéder</w:t>
+      </w:r>
+      <w:proofErr w:type="spellEnd"/>
+      <w:r>
+        <w:t xml:space="preserve"> à </w:t>
+      </w:r>
+      <w:proofErr w:type="spellStart"/>
+      <w:r>
+        <w:t>mon</w:t>
+      </w:r>
+      <w:proofErr w:type="spellEnd"/>
+      <w:r>
+        <w:t xml:space="preserve"> </w:t>
+      </w:r>
+      <w:proofErr w:type="spellStart"/>
+      <w:r>
+        <w:t>compte</w:t>
+      </w:r>
+      <w:proofErr w:type="spellEnd"/>
+      <w:r>
+        <w:t>.','</w:t>
+      </w:r>
+      <w:proofErr w:type="spellStart"/>
       <w:r>
         <w:rPr>
           <w:b/>
@@ -3306,9 +4764,11 @@
         </w:rPr>
         <w:t>en</w:t>
       </w:r>
+      <w:proofErr w:type="spellEnd"/>
       <w:r>
         <w:t xml:space="preserve">') AS </w:t>
       </w:r>
+      <w:proofErr w:type="spellStart"/>
       <w:r>
         <w:rPr>
           <w:b/>
@@ -3316,6 +4776,7 @@
         </w:rPr>
         <w:t>translated_text</w:t>
       </w:r>
+      <w:proofErr w:type="spellEnd"/>
       <w:r>
         <w:t>;</w:t>
       </w:r>
@@ -3337,7 +4798,6 @@
         <w:rPr>
           <w:noProof/>
         </w:rPr>
-        <w:lastRenderedPageBreak/>
         <w:drawing>
           <wp:inline distT="0" distB="0" distL="0" distR="0" wp14:anchorId="1ED13CAF" wp14:editId="32BBAF4C">
             <wp:extent cx="6277599" cy="2811913"/>
@@ -3380,6 +4840,7 @@
         <w:rPr>
           <w:noProof/>
         </w:rPr>
+        <w:lastRenderedPageBreak/>
         <w:drawing>
           <wp:inline distT="0" distB="0" distL="0" distR="0" wp14:anchorId="69C684E7" wp14:editId="7AB76420">
             <wp:extent cx="6333260" cy="2588455"/>
@@ -3442,7 +4903,15 @@
     </w:p>
     <w:p>
       <w:r>
-        <w:t>In our Streamlit app, we:</w:t>
+        <w:t xml:space="preserve">In our </w:t>
+      </w:r>
+      <w:proofErr w:type="spellStart"/>
+      <w:r>
+        <w:t>Streamlit</w:t>
+      </w:r>
+      <w:proofErr w:type="spellEnd"/>
+      <w:r>
+        <w:t xml:space="preserve"> app, we:</w:t>
       </w:r>
     </w:p>
     <w:p>
@@ -3474,7 +4943,15 @@
         </w:numPr>
       </w:pPr>
       <w:r>
-        <w:t xml:space="preserve">Used SUMMARIZE() to </w:t>
+        <w:t xml:space="preserve">Used </w:t>
+      </w:r>
+      <w:proofErr w:type="gramStart"/>
+      <w:r>
+        <w:t>SUMMARIZE(</w:t>
+      </w:r>
+      <w:proofErr w:type="gramEnd"/>
+      <w:r>
+        <w:t xml:space="preserve">) to </w:t>
       </w:r>
       <w:r>
         <w:rPr>
@@ -3495,14 +4972,31 @@
         </w:numPr>
       </w:pPr>
       <w:r>
-        <w:t xml:space="preserve">Used SENTIMENT() to </w:t>
-      </w:r>
-      <w:r>
-        <w:rPr>
-          <w:b/>
-          <w:bCs/>
-        </w:rPr>
-        <w:t>analyze the mood</w:t>
+        <w:t xml:space="preserve">Used </w:t>
+      </w:r>
+      <w:proofErr w:type="gramStart"/>
+      <w:r>
+        <w:t>SENTIMENT(</w:t>
+      </w:r>
+      <w:proofErr w:type="gramEnd"/>
+      <w:r>
+        <w:t xml:space="preserve">) to </w:t>
+      </w:r>
+      <w:proofErr w:type="spellStart"/>
+      <w:r>
+        <w:rPr>
+          <w:b/>
+          <w:bCs/>
+        </w:rPr>
+        <w:t>analyze</w:t>
+      </w:r>
+      <w:proofErr w:type="spellEnd"/>
+      <w:r>
+        <w:rPr>
+          <w:b/>
+          <w:bCs/>
+        </w:rPr>
+        <w:t xml:space="preserve"> the mood</w:t>
       </w:r>
       <w:r>
         <w:t xml:space="preserve"> of the conversation.</w:t>
@@ -3516,7 +5010,15 @@
         </w:numPr>
       </w:pPr>
       <w:r>
-        <w:t xml:space="preserve">Used CLASSIFY_TEXT() to </w:t>
+        <w:t>Used CLASSIFY_</w:t>
+      </w:r>
+      <w:proofErr w:type="gramStart"/>
+      <w:r>
+        <w:t>TEXT(</w:t>
+      </w:r>
+      <w:proofErr w:type="gramEnd"/>
+      <w:r>
+        <w:t xml:space="preserve">) to </w:t>
       </w:r>
       <w:r>
         <w:rPr>
@@ -3537,7 +5039,15 @@
         </w:numPr>
       </w:pPr>
       <w:r>
-        <w:t xml:space="preserve">Used TRANSLATE() to </w:t>
+        <w:t xml:space="preserve">Used </w:t>
+      </w:r>
+      <w:proofErr w:type="gramStart"/>
+      <w:r>
+        <w:t>TRANSLATE(</w:t>
+      </w:r>
+      <w:proofErr w:type="gramEnd"/>
+      <w:r>
+        <w:t xml:space="preserve">) to </w:t>
       </w:r>
       <w:r>
         <w:rPr>
@@ -3601,8 +5111,16 @@
         <w:t xml:space="preserve"> in a friendly web app!</w:t>
       </w:r>
     </w:p>
-    <w:p/>
-    <w:p/>
+    <w:p>
+      <w:r>
+        <w:rPr>
+          <w:rFonts w:cstheme="minorHAnsi"/>
+        </w:rPr>
+        <w:pict w14:anchorId="01D7CE7A">
+          <v:rect id="_x0000_i1250" style="width:0;height:1.5pt" o:hralign="center" o:hrstd="t" o:hr="t" fillcolor="#a0a0a0" stroked="f"/>
+        </w:pict>
+      </w:r>
+    </w:p>
     <w:p>
       <w:pPr>
         <w:rPr>
@@ -3616,7 +5134,6 @@
           <w:b/>
           <w:bCs/>
         </w:rPr>
-        <w:lastRenderedPageBreak/>
         <w:t>🎯</w:t>
       </w:r>
       <w:r>
@@ -3754,7 +5271,15 @@
           </w:tcPr>
           <w:p>
             <w:r>
-              <w:t>Can analyze thousands of records at once</w:t>
+              <w:t xml:space="preserve">Can </w:t>
+            </w:r>
+            <w:proofErr w:type="spellStart"/>
+            <w:r>
+              <w:t>analyze</w:t>
+            </w:r>
+            <w:proofErr w:type="spellEnd"/>
+            <w:r>
+              <w:t xml:space="preserve"> thousands of records at once</w:t>
             </w:r>
           </w:p>
         </w:tc>
@@ -3879,17 +5404,27 @@
     <w:p>
       <w:pPr>
         <w:rPr>
-          <w:rFonts w:cstheme="minorHAnsi"/>
-          <w:b/>
-          <w:bCs/>
-        </w:rPr>
-      </w:pPr>
-      <w:r>
-        <w:rPr>
           <w:rFonts w:ascii="Segoe UI Emoji" w:hAnsi="Segoe UI Emoji" w:cs="Segoe UI Emoji"/>
           <w:b/>
           <w:bCs/>
         </w:rPr>
+      </w:pPr>
+    </w:p>
+    <w:p>
+      <w:pPr>
+        <w:rPr>
+          <w:rFonts w:cstheme="minorHAnsi"/>
+          <w:b/>
+          <w:bCs/>
+        </w:rPr>
+      </w:pPr>
+      <w:r>
+        <w:rPr>
+          <w:rFonts w:ascii="Segoe UI Emoji" w:hAnsi="Segoe UI Emoji" w:cs="Segoe UI Emoji"/>
+          <w:b/>
+          <w:bCs/>
+        </w:rPr>
+        <w:lastRenderedPageBreak/>
         <w:t>✅</w:t>
       </w:r>
       <w:r>
@@ -3958,6 +5493,7 @@
         </w:rPr>
         <w:t xml:space="preserve">Unknown user-defined function </w:t>
       </w:r>
+      <w:proofErr w:type="gramStart"/>
       <w:r>
         <w:rPr>
           <w:rFonts w:cstheme="minorHAnsi"/>
@@ -3966,6 +5502,7 @@
         </w:rPr>
         <w:t>SNOWFLAKE.CORTEX.SUMMARIZE</w:t>
       </w:r>
+      <w:proofErr w:type="gramEnd"/>
     </w:p>
     <w:p>
       <w:pPr>
@@ -4130,7 +5667,25 @@
           <w:b/>
           <w:bCs/>
         </w:rPr>
-        <w:t>SELECT SNOWFLAKE.CORTEX.SUMMARIZE('your input text') AS result;</w:t>
+        <w:t xml:space="preserve">SELECT </w:t>
+      </w:r>
+      <w:proofErr w:type="gramStart"/>
+      <w:r>
+        <w:rPr>
+          <w:rFonts w:cstheme="minorHAnsi"/>
+          <w:b/>
+          <w:bCs/>
+        </w:rPr>
+        <w:t>SNOWFLAKE.CORTEX.SUMMARIZE</w:t>
+      </w:r>
+      <w:proofErr w:type="gramEnd"/>
+      <w:r>
+        <w:rPr>
+          <w:rFonts w:cstheme="minorHAnsi"/>
+          <w:b/>
+          <w:bCs/>
+        </w:rPr>
+        <w:t>('your input text') AS result;</w:t>
       </w:r>
     </w:p>
     <w:p>
@@ -4311,7 +5866,6 @@
         <w:rPr>
           <w:rFonts w:cstheme="minorHAnsi"/>
         </w:rPr>
-        <w:lastRenderedPageBreak/>
         <w:pict w14:anchorId="19BD897E">
           <v:rect id="_x0000_i1170" style="width:0;height:1.5pt" o:hralign="center" o:hrstd="t" o:hr="t" fillcolor="#a0a0a0" stroked="f"/>
         </w:pict>
@@ -4506,23 +6060,78 @@
           <w:b/>
           <w:bCs/>
         </w:rPr>
-        <w:t xml:space="preserve">    SELECT SNOWFLAKE.CORTEX.SUMMARIZE($${selected_transcript}$$) AS summary</w:t>
-      </w:r>
-    </w:p>
-    <w:p>
-      <w:pPr>
-        <w:rPr>
-          <w:rFonts w:cstheme="minorHAnsi"/>
-          <w:b/>
-          <w:bCs/>
-        </w:rPr>
-      </w:pPr>
-      <w:r>
-        <w:rPr>
-          <w:rFonts w:cstheme="minorHAnsi"/>
-          <w:b/>
-          <w:bCs/>
-        </w:rPr>
+        <w:t xml:space="preserve">    SELECT </w:t>
+      </w:r>
+      <w:proofErr w:type="gramStart"/>
+      <w:r>
+        <w:rPr>
+          <w:rFonts w:cstheme="minorHAnsi"/>
+          <w:b/>
+          <w:bCs/>
+        </w:rPr>
+        <w:t>SNOWFLAKE.CORTEX.SUMMARIZE</w:t>
+      </w:r>
+      <w:proofErr w:type="gramEnd"/>
+      <w:r>
+        <w:rPr>
+          <w:rFonts w:cstheme="minorHAnsi"/>
+          <w:b/>
+          <w:bCs/>
+        </w:rPr>
+        <w:t>($${</w:t>
+      </w:r>
+      <w:proofErr w:type="spellStart"/>
+      <w:r>
+        <w:rPr>
+          <w:rFonts w:cstheme="minorHAnsi"/>
+          <w:b/>
+          <w:bCs/>
+        </w:rPr>
+        <w:t>selected_</w:t>
+      </w:r>
+      <w:proofErr w:type="gramStart"/>
+      <w:r>
+        <w:rPr>
+          <w:rFonts w:cstheme="minorHAnsi"/>
+          <w:b/>
+          <w:bCs/>
+        </w:rPr>
+        <w:t>transcript</w:t>
+      </w:r>
+      <w:proofErr w:type="spellEnd"/>
+      <w:r>
+        <w:rPr>
+          <w:rFonts w:cstheme="minorHAnsi"/>
+          <w:b/>
+          <w:bCs/>
+        </w:rPr>
+        <w:t>}$</w:t>
+      </w:r>
+      <w:proofErr w:type="gramEnd"/>
+      <w:r>
+        <w:rPr>
+          <w:rFonts w:cstheme="minorHAnsi"/>
+          <w:b/>
+          <w:bCs/>
+        </w:rPr>
+        <w:t>$) AS summary</w:t>
+      </w:r>
+    </w:p>
+    <w:p>
+      <w:pPr>
+        <w:rPr>
+          <w:rFonts w:cstheme="minorHAnsi"/>
+          <w:b/>
+          <w:bCs/>
+        </w:rPr>
+      </w:pPr>
+      <w:r>
+        <w:rPr>
+          <w:rFonts w:cstheme="minorHAnsi"/>
+          <w:b/>
+          <w:bCs/>
+        </w:rPr>
+        <w:lastRenderedPageBreak/>
         <w:t>"""</w:t>
       </w:r>
     </w:p>
@@ -4538,7 +6147,43 @@
           <w:b/>
           <w:bCs/>
         </w:rPr>
-        <w:t>result = session.sql(query).collect()</w:t>
+        <w:t xml:space="preserve">result = </w:t>
+      </w:r>
+      <w:proofErr w:type="spellStart"/>
+      <w:r>
+        <w:rPr>
+          <w:rFonts w:cstheme="minorHAnsi"/>
+          <w:b/>
+          <w:bCs/>
+        </w:rPr>
+        <w:t>session.sql</w:t>
+      </w:r>
+      <w:proofErr w:type="spellEnd"/>
+      <w:r>
+        <w:rPr>
+          <w:rFonts w:cstheme="minorHAnsi"/>
+          <w:b/>
+          <w:bCs/>
+        </w:rPr>
+        <w:t>(query</w:t>
+      </w:r>
+      <w:proofErr w:type="gramStart"/>
+      <w:r>
+        <w:rPr>
+          <w:rFonts w:cstheme="minorHAnsi"/>
+          <w:b/>
+          <w:bCs/>
+        </w:rPr>
+        <w:t>).collect</w:t>
+      </w:r>
+      <w:proofErr w:type="gramEnd"/>
+      <w:r>
+        <w:rPr>
+          <w:rFonts w:cstheme="minorHAnsi"/>
+          <w:b/>
+          <w:bCs/>
+        </w:rPr>
+        <w:t>()</w:t>
       </w:r>
     </w:p>
     <w:p>
@@ -4589,6 +6234,8 @@
           <w:bCs/>
         </w:rPr>
       </w:pPr>
+      <w:proofErr w:type="spellStart"/>
+      <w:proofErr w:type="gramStart"/>
       <w:r>
         <w:rPr>
           <w:rFonts w:cstheme="minorHAnsi"/>
@@ -4601,7 +6248,15 @@
         <w:rPr>
           <w:rFonts w:cstheme="minorHAnsi"/>
         </w:rPr>
-        <w:t xml:space="preserve">:Invalid model name: </w:t>
+        <w:t>:Invalid</w:t>
+      </w:r>
+      <w:proofErr w:type="spellEnd"/>
+      <w:proofErr w:type="gramEnd"/>
+      <w:r>
+        <w:rPr>
+          <w:rFonts w:cstheme="minorHAnsi"/>
+        </w:rPr>
+        <w:t xml:space="preserve"> model name: </w:t>
       </w:r>
       <w:r>
         <w:rPr>
@@ -4681,7 +6336,43 @@
           <w:b/>
           <w:bCs/>
         </w:rPr>
-        <w:t>SELECT * FROM SNOWFLAKE.CORTEX.LIST_MODELS();</w:t>
+        <w:t xml:space="preserve">SELECT * FROM </w:t>
+      </w:r>
+      <w:proofErr w:type="gramStart"/>
+      <w:r>
+        <w:rPr>
+          <w:rFonts w:cstheme="minorHAnsi"/>
+          <w:b/>
+          <w:bCs/>
+        </w:rPr>
+        <w:t>SNOWFLAKE.CORTEX.LIST</w:t>
+      </w:r>
+      <w:proofErr w:type="gramEnd"/>
+      <w:r>
+        <w:rPr>
+          <w:rFonts w:cstheme="minorHAnsi"/>
+          <w:b/>
+          <w:bCs/>
+        </w:rPr>
+        <w:t>_</w:t>
+      </w:r>
+      <w:proofErr w:type="gramStart"/>
+      <w:r>
+        <w:rPr>
+          <w:rFonts w:cstheme="minorHAnsi"/>
+          <w:b/>
+          <w:bCs/>
+        </w:rPr>
+        <w:t>MODELS(</w:t>
+      </w:r>
+      <w:proofErr w:type="gramEnd"/>
+      <w:r>
+        <w:rPr>
+          <w:rFonts w:cstheme="minorHAnsi"/>
+          <w:b/>
+          <w:bCs/>
+        </w:rPr>
+        <w:t>);</w:t>
       </w:r>
     </w:p>
     <w:p>
@@ -4745,11 +6436,19 @@
           <w:rFonts w:cstheme="minorHAnsi"/>
         </w:rPr>
       </w:pPr>
-      <w:r>
-        <w:rPr>
-          <w:rFonts w:cstheme="minorHAnsi"/>
-        </w:rPr>
-        <w:t>anthropic.claude-v1</w:t>
+      <w:proofErr w:type="gramStart"/>
+      <w:r>
+        <w:rPr>
+          <w:rFonts w:cstheme="minorHAnsi"/>
+        </w:rPr>
+        <w:t>anthropic.claude</w:t>
+      </w:r>
+      <w:proofErr w:type="gramEnd"/>
+      <w:r>
+        <w:rPr>
+          <w:rFonts w:cstheme="minorHAnsi"/>
+        </w:rPr>
+        <w:t>-v1</w:t>
       </w:r>
     </w:p>
     <w:p>
@@ -4861,7 +6560,37 @@
         <w:rPr>
           <w:rFonts w:cstheme="minorHAnsi"/>
         </w:rPr>
-        <w:t>Use SUBSTR() in SQL or .str.slice() in pandas to reduce length</w:t>
+        <w:t xml:space="preserve">Use </w:t>
+      </w:r>
+      <w:proofErr w:type="gramStart"/>
+      <w:r>
+        <w:rPr>
+          <w:rFonts w:cstheme="minorHAnsi"/>
+        </w:rPr>
+        <w:t>SUBSTR(</w:t>
+      </w:r>
+      <w:proofErr w:type="gramEnd"/>
+      <w:r>
+        <w:rPr>
+          <w:rFonts w:cstheme="minorHAnsi"/>
+        </w:rPr>
+        <w:t>) in SQL or .</w:t>
+      </w:r>
+      <w:proofErr w:type="spellStart"/>
+      <w:proofErr w:type="gramStart"/>
+      <w:r>
+        <w:rPr>
+          <w:rFonts w:cstheme="minorHAnsi"/>
+        </w:rPr>
+        <w:t>str.slice</w:t>
+      </w:r>
+      <w:proofErr w:type="spellEnd"/>
+      <w:proofErr w:type="gramEnd"/>
+      <w:r>
+        <w:rPr>
+          <w:rFonts w:cstheme="minorHAnsi"/>
+        </w:rPr>
+        <w:t>() in pandas to reduce length</w:t>
       </w:r>
     </w:p>
     <w:p>
@@ -4878,7 +6607,6 @@
         <w:rPr>
           <w:rFonts w:cstheme="minorHAnsi"/>
         </w:rPr>
-        <w:lastRenderedPageBreak/>
         <w:t>Summarize large text before feeding it to other functions</w:t>
       </w:r>
     </w:p>
@@ -4953,7 +6681,21 @@
         <w:rPr>
           <w:rFonts w:cstheme="minorHAnsi"/>
         </w:rPr>
-        <w:t>Unknown function SNOWFLAKE.CORTEX.ESTIMATE_TOKENS</w:t>
+        <w:t xml:space="preserve">Unknown function </w:t>
+      </w:r>
+      <w:proofErr w:type="gramStart"/>
+      <w:r>
+        <w:rPr>
+          <w:rFonts w:cstheme="minorHAnsi"/>
+        </w:rPr>
+        <w:t>SNOWFLAKE.CORTEX.ESTIMATE</w:t>
+      </w:r>
+      <w:proofErr w:type="gramEnd"/>
+      <w:r>
+        <w:rPr>
+          <w:rFonts w:cstheme="minorHAnsi"/>
+        </w:rPr>
+        <w:t>_TOKENS</w:t>
       </w:r>
     </w:p>
     <w:p>
@@ -5025,19 +6767,28 @@
         <w:rPr>
           <w:rFonts w:cstheme="minorHAnsi"/>
         </w:rPr>
-        <w:t>For now, use an external estimator like Python + tiktoken</w:t>
-      </w:r>
-    </w:p>
-    <w:p>
-      <w:pPr>
-        <w:rPr>
-          <w:rFonts w:cstheme="minorHAnsi"/>
-        </w:rPr>
-      </w:pPr>
-      <w:r>
-        <w:rPr>
-          <w:rFonts w:cstheme="minorHAnsi"/>
-        </w:rPr>
+        <w:t xml:space="preserve">For now, use an external estimator like Python + </w:t>
+      </w:r>
+      <w:proofErr w:type="spellStart"/>
+      <w:r>
+        <w:rPr>
+          <w:rFonts w:cstheme="minorHAnsi"/>
+        </w:rPr>
+        <w:t>tiktoken</w:t>
+      </w:r>
+      <w:proofErr w:type="spellEnd"/>
+    </w:p>
+    <w:p>
+      <w:pPr>
+        <w:rPr>
+          <w:rFonts w:cstheme="minorHAnsi"/>
+        </w:rPr>
+      </w:pPr>
+      <w:r>
+        <w:rPr>
+          <w:rFonts w:cstheme="minorHAnsi"/>
+        </w:rPr>
+        <w:lastRenderedPageBreak/>
         <w:pict w14:anchorId="0A76F85E">
           <v:rect id="_x0000_i1174" style="width:0;height:1.5pt" o:hralign="center" o:hrstd="t" o:hr="t" fillcolor="#a0a0a0" stroked="f"/>
         </w:pict>
@@ -5065,7 +6816,25 @@
           <w:b/>
           <w:bCs/>
         </w:rPr>
-        <w:t xml:space="preserve"> 7. Streamlit Runtime Issues (Snowflake Native App)</w:t>
+        <w:t xml:space="preserve"> 7. </w:t>
+      </w:r>
+      <w:proofErr w:type="spellStart"/>
+      <w:r>
+        <w:rPr>
+          <w:rFonts w:cstheme="minorHAnsi"/>
+          <w:b/>
+          <w:bCs/>
+        </w:rPr>
+        <w:t>Streamlit</w:t>
+      </w:r>
+      <w:proofErr w:type="spellEnd"/>
+      <w:r>
+        <w:rPr>
+          <w:rFonts w:cstheme="minorHAnsi"/>
+          <w:b/>
+          <w:bCs/>
+        </w:rPr>
+        <w:t xml:space="preserve"> Runtime Issues (Snowflake Native App)</w:t>
       </w:r>
     </w:p>
     <w:p>
@@ -5184,7 +6953,35 @@
         <w:rPr>
           <w:rFonts w:cstheme="minorHAnsi"/>
         </w:rPr>
-        <w:t xml:space="preserve">    result = session.sql(query).collect()</w:t>
+        <w:t xml:space="preserve">    result = </w:t>
+      </w:r>
+      <w:proofErr w:type="spellStart"/>
+      <w:r>
+        <w:rPr>
+          <w:rFonts w:cstheme="minorHAnsi"/>
+        </w:rPr>
+        <w:t>session.sql</w:t>
+      </w:r>
+      <w:proofErr w:type="spellEnd"/>
+      <w:r>
+        <w:rPr>
+          <w:rFonts w:cstheme="minorHAnsi"/>
+        </w:rPr>
+        <w:t>(query</w:t>
+      </w:r>
+      <w:proofErr w:type="gramStart"/>
+      <w:r>
+        <w:rPr>
+          <w:rFonts w:cstheme="minorHAnsi"/>
+        </w:rPr>
+        <w:t>).collect</w:t>
+      </w:r>
+      <w:proofErr w:type="gramEnd"/>
+      <w:r>
+        <w:rPr>
+          <w:rFonts w:cstheme="minorHAnsi"/>
+        </w:rPr>
+        <w:t>()</w:t>
       </w:r>
     </w:p>
     <w:p>
@@ -5210,7 +7007,37 @@
         <w:rPr>
           <w:rFonts w:cstheme="minorHAnsi"/>
         </w:rPr>
-        <w:t xml:space="preserve">    st.error(f"Error: {str(e)}")</w:t>
+        <w:t xml:space="preserve">    </w:t>
+      </w:r>
+      <w:proofErr w:type="spellStart"/>
+      <w:proofErr w:type="gramStart"/>
+      <w:r>
+        <w:rPr>
+          <w:rFonts w:cstheme="minorHAnsi"/>
+        </w:rPr>
+        <w:t>st.error</w:t>
+      </w:r>
+      <w:proofErr w:type="spellEnd"/>
+      <w:proofErr w:type="gramEnd"/>
+      <w:r>
+        <w:rPr>
+          <w:rFonts w:cstheme="minorHAnsi"/>
+        </w:rPr>
+        <w:t>(</w:t>
+      </w:r>
+      <w:proofErr w:type="spellStart"/>
+      <w:r>
+        <w:rPr>
+          <w:rFonts w:cstheme="minorHAnsi"/>
+        </w:rPr>
+        <w:t>f"Error</w:t>
+      </w:r>
+      <w:proofErr w:type="spellEnd"/>
+      <w:r>
+        <w:rPr>
+          <w:rFonts w:cstheme="minorHAnsi"/>
+        </w:rPr>
+        <w:t>: {str(e)}")</w:t>
       </w:r>
     </w:p>
     <w:p>
@@ -5496,8 +7323,16 @@
               <w:rPr>
                 <w:rFonts w:cstheme="minorHAnsi"/>
               </w:rPr>
-              <w:t>Use try/except to catch runtime errors in Streamlit</w:t>
+              <w:t xml:space="preserve">Use try/except to catch runtime errors in </w:t>
             </w:r>
+            <w:proofErr w:type="spellStart"/>
+            <w:r>
+              <w:rPr>
+                <w:rFonts w:cstheme="minorHAnsi"/>
+              </w:rPr>
+              <w:t>Streamlit</w:t>
+            </w:r>
+            <w:proofErr w:type="spellEnd"/>
           </w:p>
         </w:tc>
       </w:tr>
@@ -5522,7 +7357,6 @@
               <w:rPr>
                 <w:rFonts w:cstheme="minorHAnsi"/>
               </w:rPr>
-              <w:lastRenderedPageBreak/>
               <w:t>4</w:t>
             </w:r>
           </w:p>
@@ -5543,7 +7377,23 @@
               <w:rPr>
                 <w:rFonts w:cstheme="minorHAnsi"/>
               </w:rPr>
-              <w:t>Log or print debug messages (st.write(...))</w:t>
+              <w:t>Log or print debug messages (</w:t>
+            </w:r>
+            <w:proofErr w:type="spellStart"/>
+            <w:proofErr w:type="gramStart"/>
+            <w:r>
+              <w:rPr>
+                <w:rFonts w:cstheme="minorHAnsi"/>
+              </w:rPr>
+              <w:t>st.write</w:t>
+            </w:r>
+            <w:proofErr w:type="spellEnd"/>
+            <w:proofErr w:type="gramEnd"/>
+            <w:r>
+              <w:rPr>
+                <w:rFonts w:cstheme="minorHAnsi"/>
+              </w:rPr>
+              <w:t>(...))</w:t>
             </w:r>
           </w:p>
         </w:tc>
@@ -5692,7 +7542,25 @@
           <w:b/>
           <w:bCs/>
         </w:rPr>
-        <w:t xml:space="preserve"> Cost Components of Streamlit in Snowflake</w:t>
+        <w:t xml:space="preserve"> Cost Components of </w:t>
+      </w:r>
+      <w:proofErr w:type="spellStart"/>
+      <w:r>
+        <w:rPr>
+          <w:rFonts w:cstheme="minorHAnsi"/>
+          <w:b/>
+          <w:bCs/>
+        </w:rPr>
+        <w:t>Streamlit</w:t>
+      </w:r>
+      <w:proofErr w:type="spellEnd"/>
+      <w:r>
+        <w:rPr>
+          <w:rFonts w:cstheme="minorHAnsi"/>
+          <w:b/>
+          <w:bCs/>
+        </w:rPr>
+        <w:t xml:space="preserve"> in Snowflake</w:t>
       </w:r>
     </w:p>
     <w:p>
@@ -5728,7 +7596,21 @@
         <w:rPr>
           <w:rFonts w:cstheme="minorHAnsi"/>
         </w:rPr>
-        <w:t xml:space="preserve">Each Streamlit app requires a </w:t>
+        <w:t xml:space="preserve">Each </w:t>
+      </w:r>
+      <w:proofErr w:type="spellStart"/>
+      <w:r>
+        <w:rPr>
+          <w:rFonts w:cstheme="minorHAnsi"/>
+        </w:rPr>
+        <w:t>Streamlit</w:t>
+      </w:r>
+      <w:proofErr w:type="spellEnd"/>
+      <w:r>
+        <w:rPr>
+          <w:rFonts w:cstheme="minorHAnsi"/>
+        </w:rPr>
+        <w:t xml:space="preserve"> app requires a </w:t>
       </w:r>
       <w:r>
         <w:rPr>
@@ -5759,6 +7641,7 @@
         <w:rPr>
           <w:rFonts w:cstheme="minorHAnsi"/>
         </w:rPr>
+        <w:lastRenderedPageBreak/>
         <w:t>The warehouse remains active as long as the app's WebSocket connection is open, which typically stays alive for about 15 minutes after the last user interaction.</w:t>
       </w:r>
     </w:p>
@@ -5838,7 +7721,21 @@
         <w:rPr>
           <w:rFonts w:cstheme="minorHAnsi"/>
         </w:rPr>
-        <w:t xml:space="preserve">If your Streamlit app utilizes </w:t>
+        <w:t xml:space="preserve">If your </w:t>
+      </w:r>
+      <w:proofErr w:type="spellStart"/>
+      <w:r>
+        <w:rPr>
+          <w:rFonts w:cstheme="minorHAnsi"/>
+        </w:rPr>
+        <w:t>Streamlit</w:t>
+      </w:r>
+      <w:proofErr w:type="spellEnd"/>
+      <w:r>
+        <w:rPr>
+          <w:rFonts w:cstheme="minorHAnsi"/>
+        </w:rPr>
+        <w:t xml:space="preserve"> app utilizes </w:t>
       </w:r>
       <w:r>
         <w:rPr>
@@ -5995,7 +7892,6 @@
           <w:b/>
           <w:bCs/>
         </w:rPr>
-        <w:lastRenderedPageBreak/>
         <w:t>🧠</w:t>
       </w:r>
       <w:r>
@@ -6029,7 +7925,14 @@
         <w:rPr>
           <w:rFonts w:cstheme="minorHAnsi"/>
         </w:rPr>
-        <w:t>: Select a warehouse size that matches your app's workload. For development or low-traffic apps, smaller warehouses (e.g., X-Small or Small) can be more cost-effective.</w:t>
+        <w:t>: Select a warehouse size that matches your app's workload. For development or low-traffic apps, smaller warehouses (e.g., X-Small or Small) can be more cost-</w:t>
+      </w:r>
+      <w:proofErr w:type="spellStart"/>
+      <w:r>
+        <w:rPr>
+          <w:rFonts w:cstheme="minorHAnsi"/>
+        </w:rPr>
+        <w:t>effective.</w:t>
       </w:r>
       <w:hyperlink r:id="rId27" w:tgtFrame="_blank" w:history="1">
         <w:r>
@@ -6039,6 +7942,7 @@
           </w:rPr>
           <w:t>Snowflake</w:t>
         </w:r>
+        <w:proofErr w:type="spellEnd"/>
       </w:hyperlink>
     </w:p>
     <w:p>
@@ -6126,7 +8030,22 @@
         <w:rPr>
           <w:rFonts w:cstheme="minorHAnsi"/>
         </w:rPr>
-        <w:t>By understanding these components and implementing cost-saving strategies, you can effectively manage expenses associated with running Streamlit apps in Snowflake.</w:t>
+        <w:lastRenderedPageBreak/>
+        <w:t xml:space="preserve">By understanding these components and implementing cost-saving strategies, you can effectively manage expenses associated with running </w:t>
+      </w:r>
+      <w:proofErr w:type="spellStart"/>
+      <w:r>
+        <w:rPr>
+          <w:rFonts w:cstheme="minorHAnsi"/>
+        </w:rPr>
+        <w:t>Streamlit</w:t>
+      </w:r>
+      <w:proofErr w:type="spellEnd"/>
+      <w:r>
+        <w:rPr>
+          <w:rFonts w:cstheme="minorHAnsi"/>
+        </w:rPr>
+        <w:t xml:space="preserve"> apps in Snowflake.</w:t>
       </w:r>
     </w:p>
     <w:p>
@@ -6166,7 +8085,23 @@
           <w:b/>
           <w:bCs/>
         </w:rPr>
-        <w:t xml:space="preserve"> Snowflake Cortex – Cost Factors for AI Functions (in Our Streamlit App)</w:t>
+        <w:t xml:space="preserve"> Snowflake Cortex – Cost Factors for AI Functions (in Our </w:t>
+      </w:r>
+      <w:proofErr w:type="spellStart"/>
+      <w:r>
+        <w:rPr>
+          <w:b/>
+          <w:bCs/>
+        </w:rPr>
+        <w:t>Streamlit</w:t>
+      </w:r>
+      <w:proofErr w:type="spellEnd"/>
+      <w:r>
+        <w:rPr>
+          <w:b/>
+          <w:bCs/>
+        </w:rPr>
+        <w:t xml:space="preserve"> App)</w:t>
       </w:r>
     </w:p>
     <w:p>
@@ -6312,8 +8247,17 @@
           <w:b/>
           <w:bCs/>
         </w:rPr>
-        <w:t xml:space="preserve"> AI Functions We Used and Their Cost Behavior</w:t>
-      </w:r>
+        <w:t xml:space="preserve"> AI Functions We Used and Their Cost </w:t>
+      </w:r>
+      <w:proofErr w:type="spellStart"/>
+      <w:r>
+        <w:rPr>
+          <w:b/>
+          <w:bCs/>
+        </w:rPr>
+        <w:t>Behavior</w:t>
+      </w:r>
+      <w:proofErr w:type="spellEnd"/>
     </w:p>
     <w:tbl>
       <w:tblPr>
@@ -6557,7 +8501,6 @@
                 <w:b/>
                 <w:bCs/>
               </w:rPr>
-              <w:lastRenderedPageBreak/>
               <w:t>CLASSIFY_TEXT</w:t>
             </w:r>
           </w:p>
@@ -6774,16 +8717,26 @@
     <w:p>
       <w:pPr>
         <w:rPr>
-          <w:b/>
-          <w:bCs/>
-        </w:rPr>
-      </w:pPr>
-      <w:r>
-        <w:rPr>
           <w:rFonts w:ascii="Segoe UI Emoji" w:hAnsi="Segoe UI Emoji" w:cs="Segoe UI Emoji"/>
           <w:b/>
           <w:bCs/>
         </w:rPr>
+      </w:pPr>
+    </w:p>
+    <w:p>
+      <w:pPr>
+        <w:rPr>
+          <w:b/>
+          <w:bCs/>
+        </w:rPr>
+      </w:pPr>
+      <w:r>
+        <w:rPr>
+          <w:rFonts w:ascii="Segoe UI Emoji" w:hAnsi="Segoe UI Emoji" w:cs="Segoe UI Emoji"/>
+          <w:b/>
+          <w:bCs/>
+        </w:rPr>
+        <w:lastRenderedPageBreak/>
         <w:t>🔍</w:t>
       </w:r>
       <w:r>
@@ -6810,6 +8763,7 @@
       <w:r>
         <w:t xml:space="preserve"> </w:t>
       </w:r>
+      <w:proofErr w:type="gramStart"/>
       <w:r>
         <w:rPr>
           <w:b/>
@@ -6817,6 +8771,7 @@
         </w:rPr>
         <w:t>Pre-clean</w:t>
       </w:r>
+      <w:proofErr w:type="gramEnd"/>
       <w:r>
         <w:t xml:space="preserve"> the input text (remove noise, irrelevant content).</w:t>
       </w:r>
@@ -6889,7 +8844,15 @@
         <w:t>📦</w:t>
       </w:r>
       <w:r>
-        <w:t xml:space="preserve"> Cache results of calls in Streamlit to avoid repeated calls.</w:t>
+        <w:t xml:space="preserve"> Cache results of calls in </w:t>
+      </w:r>
+      <w:proofErr w:type="spellStart"/>
+      <w:r>
+        <w:t>Streamlit</w:t>
+      </w:r>
+      <w:proofErr w:type="spellEnd"/>
+      <w:r>
+        <w:t xml:space="preserve"> to avoid repeated calls.</w:t>
       </w:r>
     </w:p>
     <w:p>
@@ -7027,7 +8990,15 @@
           </w:tcPr>
           <w:p>
             <w:r>
-              <w:t>Using SUMMARIZE() on large call transcripts</w:t>
+              <w:t xml:space="preserve">Using </w:t>
+            </w:r>
+            <w:proofErr w:type="gramStart"/>
+            <w:r>
+              <w:t>SUMMARIZE(</w:t>
+            </w:r>
+            <w:proofErr w:type="gramEnd"/>
+            <w:r>
+              <w:t>) on large call transcripts</w:t>
             </w:r>
           </w:p>
         </w:tc>
@@ -7062,7 +9033,23 @@
           </w:tcPr>
           <w:p>
             <w:r>
-              <w:t>Calling SENTIMENT() or CLASSIFY_TEXT()</w:t>
+              <w:t xml:space="preserve">Calling </w:t>
+            </w:r>
+            <w:proofErr w:type="gramStart"/>
+            <w:r>
+              <w:t>SENTIMENT(</w:t>
+            </w:r>
+            <w:proofErr w:type="gramEnd"/>
+            <w:r>
+              <w:t>) or CLASSIFY_</w:t>
+            </w:r>
+            <w:proofErr w:type="gramStart"/>
+            <w:r>
+              <w:t>TEXT(</w:t>
+            </w:r>
+            <w:proofErr w:type="gramEnd"/>
+            <w:r>
+              <w:t>)</w:t>
             </w:r>
           </w:p>
         </w:tc>
@@ -7097,7 +9084,15 @@
           </w:tcPr>
           <w:p>
             <w:r>
-              <w:t>Adding TRANSLATE() for multilingual support</w:t>
+              <w:t xml:space="preserve">Adding </w:t>
+            </w:r>
+            <w:proofErr w:type="gramStart"/>
+            <w:r>
+              <w:t>TRANSLATE(</w:t>
+            </w:r>
+            <w:proofErr w:type="gramEnd"/>
+            <w:r>
+              <w:t>) for multilingual support</w:t>
             </w:r>
           </w:p>
         </w:tc>
@@ -7543,8 +9538,17 @@
         <w:b/>
         <w:bCs/>
       </w:rPr>
-      <w:t>Introduction to Streamlit</w:t>
+      <w:t xml:space="preserve">Introduction to </w:t>
     </w:r>
+    <w:proofErr w:type="spellStart"/>
+    <w:r>
+      <w:rPr>
+        <w:b/>
+        <w:bCs/>
+      </w:rPr>
+      <w:t>Streamlit</w:t>
+    </w:r>
+    <w:proofErr w:type="spellEnd"/>
     <w:r>
       <w:rPr>
         <w:b/>
@@ -7557,14 +9561,30 @@
         <w:b/>
         <w:bCs/>
       </w:rPr>
-      <w:t xml:space="preserve">Snowflake Cortex AI </w:t>
+      <w:t xml:space="preserve">Snowflake Cortex </w:t>
+    </w:r>
+    <w:proofErr w:type="gramStart"/>
+    <w:r>
+      <w:rPr>
+        <w:b/>
+        <w:bCs/>
+      </w:rPr>
+      <w:t xml:space="preserve">AI </w:t>
     </w:r>
     <w:r>
       <w:rPr>
         <w:b/>
         <w:bCs/>
       </w:rPr>
-      <w:t xml:space="preserve"> – A Beginner’s Guide</w:t>
+      <w:t xml:space="preserve"> –</w:t>
+    </w:r>
+    <w:proofErr w:type="gramEnd"/>
+    <w:r>
+      <w:rPr>
+        <w:b/>
+        <w:bCs/>
+      </w:rPr>
+      <w:t xml:space="preserve"> A Beginner’s Guide</w:t>
     </w:r>
   </w:p>
 </w:hdr>
@@ -8066,6 +10086,155 @@
     </w:lvl>
   </w:abstractNum>
   <w:abstractNum w:abstractNumId="3" w15:restartNumberingAfterBreak="0">
+    <w:nsid w:val="0B3E7048"/>
+    <w:multiLevelType w:val="multilevel"/>
+    <w:tmpl w:val="98A8ED96"/>
+    <w:lvl w:ilvl="0">
+      <w:start w:val="1"/>
+      <w:numFmt w:val="bullet"/>
+      <w:lvlText w:val=""/>
+      <w:lvlJc w:val="left"/>
+      <w:pPr>
+        <w:tabs>
+          <w:tab w:val="num" w:pos="720"/>
+        </w:tabs>
+        <w:ind w:left="720" w:hanging="360"/>
+      </w:pPr>
+      <w:rPr>
+        <w:rFonts w:ascii="Symbol" w:hAnsi="Symbol" w:hint="default"/>
+        <w:sz w:val="20"/>
+      </w:rPr>
+    </w:lvl>
+    <w:lvl w:ilvl="1" w:tentative="1">
+      <w:start w:val="1"/>
+      <w:numFmt w:val="bullet"/>
+      <w:lvlText w:val="o"/>
+      <w:lvlJc w:val="left"/>
+      <w:pPr>
+        <w:tabs>
+          <w:tab w:val="num" w:pos="1440"/>
+        </w:tabs>
+        <w:ind w:left="1440" w:hanging="360"/>
+      </w:pPr>
+      <w:rPr>
+        <w:rFonts w:ascii="Courier New" w:hAnsi="Courier New" w:hint="default"/>
+        <w:sz w:val="20"/>
+      </w:rPr>
+    </w:lvl>
+    <w:lvl w:ilvl="2" w:tentative="1">
+      <w:start w:val="1"/>
+      <w:numFmt w:val="bullet"/>
+      <w:lvlText w:val=""/>
+      <w:lvlJc w:val="left"/>
+      <w:pPr>
+        <w:tabs>
+          <w:tab w:val="num" w:pos="2160"/>
+        </w:tabs>
+        <w:ind w:left="2160" w:hanging="360"/>
+      </w:pPr>
+      <w:rPr>
+        <w:rFonts w:ascii="Wingdings" w:hAnsi="Wingdings" w:hint="default"/>
+        <w:sz w:val="20"/>
+      </w:rPr>
+    </w:lvl>
+    <w:lvl w:ilvl="3" w:tentative="1">
+      <w:start w:val="1"/>
+      <w:numFmt w:val="bullet"/>
+      <w:lvlText w:val=""/>
+      <w:lvlJc w:val="left"/>
+      <w:pPr>
+        <w:tabs>
+          <w:tab w:val="num" w:pos="2880"/>
+        </w:tabs>
+        <w:ind w:left="2880" w:hanging="360"/>
+      </w:pPr>
+      <w:rPr>
+        <w:rFonts w:ascii="Wingdings" w:hAnsi="Wingdings" w:hint="default"/>
+        <w:sz w:val="20"/>
+      </w:rPr>
+    </w:lvl>
+    <w:lvl w:ilvl="4" w:tentative="1">
+      <w:start w:val="1"/>
+      <w:numFmt w:val="bullet"/>
+      <w:lvlText w:val=""/>
+      <w:lvlJc w:val="left"/>
+      <w:pPr>
+        <w:tabs>
+          <w:tab w:val="num" w:pos="3600"/>
+        </w:tabs>
+        <w:ind w:left="3600" w:hanging="360"/>
+      </w:pPr>
+      <w:rPr>
+        <w:rFonts w:ascii="Wingdings" w:hAnsi="Wingdings" w:hint="default"/>
+        <w:sz w:val="20"/>
+      </w:rPr>
+    </w:lvl>
+    <w:lvl w:ilvl="5" w:tentative="1">
+      <w:start w:val="1"/>
+      <w:numFmt w:val="bullet"/>
+      <w:lvlText w:val=""/>
+      <w:lvlJc w:val="left"/>
+      <w:pPr>
+        <w:tabs>
+          <w:tab w:val="num" w:pos="4320"/>
+        </w:tabs>
+        <w:ind w:left="4320" w:hanging="360"/>
+      </w:pPr>
+      <w:rPr>
+        <w:rFonts w:ascii="Wingdings" w:hAnsi="Wingdings" w:hint="default"/>
+        <w:sz w:val="20"/>
+      </w:rPr>
+    </w:lvl>
+    <w:lvl w:ilvl="6" w:tentative="1">
+      <w:start w:val="1"/>
+      <w:numFmt w:val="bullet"/>
+      <w:lvlText w:val=""/>
+      <w:lvlJc w:val="left"/>
+      <w:pPr>
+        <w:tabs>
+          <w:tab w:val="num" w:pos="5040"/>
+        </w:tabs>
+        <w:ind w:left="5040" w:hanging="360"/>
+      </w:pPr>
+      <w:rPr>
+        <w:rFonts w:ascii="Wingdings" w:hAnsi="Wingdings" w:hint="default"/>
+        <w:sz w:val="20"/>
+      </w:rPr>
+    </w:lvl>
+    <w:lvl w:ilvl="7" w:tentative="1">
+      <w:start w:val="1"/>
+      <w:numFmt w:val="bullet"/>
+      <w:lvlText w:val=""/>
+      <w:lvlJc w:val="left"/>
+      <w:pPr>
+        <w:tabs>
+          <w:tab w:val="num" w:pos="5760"/>
+        </w:tabs>
+        <w:ind w:left="5760" w:hanging="360"/>
+      </w:pPr>
+      <w:rPr>
+        <w:rFonts w:ascii="Wingdings" w:hAnsi="Wingdings" w:hint="default"/>
+        <w:sz w:val="20"/>
+      </w:rPr>
+    </w:lvl>
+    <w:lvl w:ilvl="8" w:tentative="1">
+      <w:start w:val="1"/>
+      <w:numFmt w:val="bullet"/>
+      <w:lvlText w:val=""/>
+      <w:lvlJc w:val="left"/>
+      <w:pPr>
+        <w:tabs>
+          <w:tab w:val="num" w:pos="6480"/>
+        </w:tabs>
+        <w:ind w:left="6480" w:hanging="360"/>
+      </w:pPr>
+      <w:rPr>
+        <w:rFonts w:ascii="Wingdings" w:hAnsi="Wingdings" w:hint="default"/>
+        <w:sz w:val="20"/>
+      </w:rPr>
+    </w:lvl>
+  </w:abstractNum>
+  <w:abstractNum w:abstractNumId="4" w15:restartNumberingAfterBreak="0">
     <w:nsid w:val="120F1007"/>
     <w:multiLevelType w:val="multilevel"/>
     <w:tmpl w:val="1448752A"/>
@@ -8214,7 +10383,156 @@
       </w:rPr>
     </w:lvl>
   </w:abstractNum>
-  <w:abstractNum w:abstractNumId="4" w15:restartNumberingAfterBreak="0">
+  <w:abstractNum w:abstractNumId="5" w15:restartNumberingAfterBreak="0">
+    <w:nsid w:val="153D7A89"/>
+    <w:multiLevelType w:val="multilevel"/>
+    <w:tmpl w:val="359AE4EC"/>
+    <w:lvl w:ilvl="0">
+      <w:start w:val="1"/>
+      <w:numFmt w:val="bullet"/>
+      <w:lvlText w:val=""/>
+      <w:lvlJc w:val="left"/>
+      <w:pPr>
+        <w:tabs>
+          <w:tab w:val="num" w:pos="720"/>
+        </w:tabs>
+        <w:ind w:left="720" w:hanging="360"/>
+      </w:pPr>
+      <w:rPr>
+        <w:rFonts w:ascii="Symbol" w:hAnsi="Symbol" w:hint="default"/>
+        <w:sz w:val="20"/>
+      </w:rPr>
+    </w:lvl>
+    <w:lvl w:ilvl="1" w:tentative="1">
+      <w:start w:val="1"/>
+      <w:numFmt w:val="bullet"/>
+      <w:lvlText w:val="o"/>
+      <w:lvlJc w:val="left"/>
+      <w:pPr>
+        <w:tabs>
+          <w:tab w:val="num" w:pos="1440"/>
+        </w:tabs>
+        <w:ind w:left="1440" w:hanging="360"/>
+      </w:pPr>
+      <w:rPr>
+        <w:rFonts w:ascii="Courier New" w:hAnsi="Courier New" w:hint="default"/>
+        <w:sz w:val="20"/>
+      </w:rPr>
+    </w:lvl>
+    <w:lvl w:ilvl="2" w:tentative="1">
+      <w:start w:val="1"/>
+      <w:numFmt w:val="bullet"/>
+      <w:lvlText w:val=""/>
+      <w:lvlJc w:val="left"/>
+      <w:pPr>
+        <w:tabs>
+          <w:tab w:val="num" w:pos="2160"/>
+        </w:tabs>
+        <w:ind w:left="2160" w:hanging="360"/>
+      </w:pPr>
+      <w:rPr>
+        <w:rFonts w:ascii="Wingdings" w:hAnsi="Wingdings" w:hint="default"/>
+        <w:sz w:val="20"/>
+      </w:rPr>
+    </w:lvl>
+    <w:lvl w:ilvl="3" w:tentative="1">
+      <w:start w:val="1"/>
+      <w:numFmt w:val="bullet"/>
+      <w:lvlText w:val=""/>
+      <w:lvlJc w:val="left"/>
+      <w:pPr>
+        <w:tabs>
+          <w:tab w:val="num" w:pos="2880"/>
+        </w:tabs>
+        <w:ind w:left="2880" w:hanging="360"/>
+      </w:pPr>
+      <w:rPr>
+        <w:rFonts w:ascii="Wingdings" w:hAnsi="Wingdings" w:hint="default"/>
+        <w:sz w:val="20"/>
+      </w:rPr>
+    </w:lvl>
+    <w:lvl w:ilvl="4" w:tentative="1">
+      <w:start w:val="1"/>
+      <w:numFmt w:val="bullet"/>
+      <w:lvlText w:val=""/>
+      <w:lvlJc w:val="left"/>
+      <w:pPr>
+        <w:tabs>
+          <w:tab w:val="num" w:pos="3600"/>
+        </w:tabs>
+        <w:ind w:left="3600" w:hanging="360"/>
+      </w:pPr>
+      <w:rPr>
+        <w:rFonts w:ascii="Wingdings" w:hAnsi="Wingdings" w:hint="default"/>
+        <w:sz w:val="20"/>
+      </w:rPr>
+    </w:lvl>
+    <w:lvl w:ilvl="5" w:tentative="1">
+      <w:start w:val="1"/>
+      <w:numFmt w:val="bullet"/>
+      <w:lvlText w:val=""/>
+      <w:lvlJc w:val="left"/>
+      <w:pPr>
+        <w:tabs>
+          <w:tab w:val="num" w:pos="4320"/>
+        </w:tabs>
+        <w:ind w:left="4320" w:hanging="360"/>
+      </w:pPr>
+      <w:rPr>
+        <w:rFonts w:ascii="Wingdings" w:hAnsi="Wingdings" w:hint="default"/>
+        <w:sz w:val="20"/>
+      </w:rPr>
+    </w:lvl>
+    <w:lvl w:ilvl="6" w:tentative="1">
+      <w:start w:val="1"/>
+      <w:numFmt w:val="bullet"/>
+      <w:lvlText w:val=""/>
+      <w:lvlJc w:val="left"/>
+      <w:pPr>
+        <w:tabs>
+          <w:tab w:val="num" w:pos="5040"/>
+        </w:tabs>
+        <w:ind w:left="5040" w:hanging="360"/>
+      </w:pPr>
+      <w:rPr>
+        <w:rFonts w:ascii="Wingdings" w:hAnsi="Wingdings" w:hint="default"/>
+        <w:sz w:val="20"/>
+      </w:rPr>
+    </w:lvl>
+    <w:lvl w:ilvl="7" w:tentative="1">
+      <w:start w:val="1"/>
+      <w:numFmt w:val="bullet"/>
+      <w:lvlText w:val=""/>
+      <w:lvlJc w:val="left"/>
+      <w:pPr>
+        <w:tabs>
+          <w:tab w:val="num" w:pos="5760"/>
+        </w:tabs>
+        <w:ind w:left="5760" w:hanging="360"/>
+      </w:pPr>
+      <w:rPr>
+        <w:rFonts w:ascii="Wingdings" w:hAnsi="Wingdings" w:hint="default"/>
+        <w:sz w:val="20"/>
+      </w:rPr>
+    </w:lvl>
+    <w:lvl w:ilvl="8" w:tentative="1">
+      <w:start w:val="1"/>
+      <w:numFmt w:val="bullet"/>
+      <w:lvlText w:val=""/>
+      <w:lvlJc w:val="left"/>
+      <w:pPr>
+        <w:tabs>
+          <w:tab w:val="num" w:pos="6480"/>
+        </w:tabs>
+        <w:ind w:left="6480" w:hanging="360"/>
+      </w:pPr>
+      <w:rPr>
+        <w:rFonts w:ascii="Wingdings" w:hAnsi="Wingdings" w:hint="default"/>
+        <w:sz w:val="20"/>
+      </w:rPr>
+    </w:lvl>
+  </w:abstractNum>
+  <w:abstractNum w:abstractNumId="6" w15:restartNumberingAfterBreak="0">
     <w:nsid w:val="20062F2C"/>
     <w:multiLevelType w:val="multilevel"/>
     <w:tmpl w:val="C45C9E7C"/>
@@ -8363,7 +10681,7 @@
       </w:rPr>
     </w:lvl>
   </w:abstractNum>
-  <w:abstractNum w:abstractNumId="5" w15:restartNumberingAfterBreak="0">
+  <w:abstractNum w:abstractNumId="7" w15:restartNumberingAfterBreak="0">
     <w:nsid w:val="215D23EC"/>
     <w:multiLevelType w:val="multilevel"/>
     <w:tmpl w:val="A168BA12"/>
@@ -8480,7 +10798,7 @@
       </w:pPr>
     </w:lvl>
   </w:abstractNum>
-  <w:abstractNum w:abstractNumId="6" w15:restartNumberingAfterBreak="0">
+  <w:abstractNum w:abstractNumId="8" w15:restartNumberingAfterBreak="0">
     <w:nsid w:val="245B6420"/>
     <w:multiLevelType w:val="multilevel"/>
     <w:tmpl w:val="B386A23C"/>
@@ -8629,7 +10947,7 @@
       </w:rPr>
     </w:lvl>
   </w:abstractNum>
-  <w:abstractNum w:abstractNumId="7" w15:restartNumberingAfterBreak="0">
+  <w:abstractNum w:abstractNumId="9" w15:restartNumberingAfterBreak="0">
     <w:nsid w:val="25376B8B"/>
     <w:multiLevelType w:val="multilevel"/>
     <w:tmpl w:val="1C44E45C"/>
@@ -8778,7 +11096,156 @@
       </w:rPr>
     </w:lvl>
   </w:abstractNum>
-  <w:abstractNum w:abstractNumId="8" w15:restartNumberingAfterBreak="0">
+  <w:abstractNum w:abstractNumId="10" w15:restartNumberingAfterBreak="0">
+    <w:nsid w:val="2697360D"/>
+    <w:multiLevelType w:val="multilevel"/>
+    <w:tmpl w:val="8276491C"/>
+    <w:lvl w:ilvl="0">
+      <w:start w:val="1"/>
+      <w:numFmt w:val="bullet"/>
+      <w:lvlText w:val=""/>
+      <w:lvlJc w:val="left"/>
+      <w:pPr>
+        <w:tabs>
+          <w:tab w:val="num" w:pos="720"/>
+        </w:tabs>
+        <w:ind w:left="720" w:hanging="360"/>
+      </w:pPr>
+      <w:rPr>
+        <w:rFonts w:ascii="Symbol" w:hAnsi="Symbol" w:hint="default"/>
+        <w:sz w:val="20"/>
+      </w:rPr>
+    </w:lvl>
+    <w:lvl w:ilvl="1" w:tentative="1">
+      <w:start w:val="1"/>
+      <w:numFmt w:val="bullet"/>
+      <w:lvlText w:val="o"/>
+      <w:lvlJc w:val="left"/>
+      <w:pPr>
+        <w:tabs>
+          <w:tab w:val="num" w:pos="1440"/>
+        </w:tabs>
+        <w:ind w:left="1440" w:hanging="360"/>
+      </w:pPr>
+      <w:rPr>
+        <w:rFonts w:ascii="Courier New" w:hAnsi="Courier New" w:hint="default"/>
+        <w:sz w:val="20"/>
+      </w:rPr>
+    </w:lvl>
+    <w:lvl w:ilvl="2" w:tentative="1">
+      <w:start w:val="1"/>
+      <w:numFmt w:val="bullet"/>
+      <w:lvlText w:val=""/>
+      <w:lvlJc w:val="left"/>
+      <w:pPr>
+        <w:tabs>
+          <w:tab w:val="num" w:pos="2160"/>
+        </w:tabs>
+        <w:ind w:left="2160" w:hanging="360"/>
+      </w:pPr>
+      <w:rPr>
+        <w:rFonts w:ascii="Wingdings" w:hAnsi="Wingdings" w:hint="default"/>
+        <w:sz w:val="20"/>
+      </w:rPr>
+    </w:lvl>
+    <w:lvl w:ilvl="3" w:tentative="1">
+      <w:start w:val="1"/>
+      <w:numFmt w:val="bullet"/>
+      <w:lvlText w:val=""/>
+      <w:lvlJc w:val="left"/>
+      <w:pPr>
+        <w:tabs>
+          <w:tab w:val="num" w:pos="2880"/>
+        </w:tabs>
+        <w:ind w:left="2880" w:hanging="360"/>
+      </w:pPr>
+      <w:rPr>
+        <w:rFonts w:ascii="Wingdings" w:hAnsi="Wingdings" w:hint="default"/>
+        <w:sz w:val="20"/>
+      </w:rPr>
+    </w:lvl>
+    <w:lvl w:ilvl="4" w:tentative="1">
+      <w:start w:val="1"/>
+      <w:numFmt w:val="bullet"/>
+      <w:lvlText w:val=""/>
+      <w:lvlJc w:val="left"/>
+      <w:pPr>
+        <w:tabs>
+          <w:tab w:val="num" w:pos="3600"/>
+        </w:tabs>
+        <w:ind w:left="3600" w:hanging="360"/>
+      </w:pPr>
+      <w:rPr>
+        <w:rFonts w:ascii="Wingdings" w:hAnsi="Wingdings" w:hint="default"/>
+        <w:sz w:val="20"/>
+      </w:rPr>
+    </w:lvl>
+    <w:lvl w:ilvl="5" w:tentative="1">
+      <w:start w:val="1"/>
+      <w:numFmt w:val="bullet"/>
+      <w:lvlText w:val=""/>
+      <w:lvlJc w:val="left"/>
+      <w:pPr>
+        <w:tabs>
+          <w:tab w:val="num" w:pos="4320"/>
+        </w:tabs>
+        <w:ind w:left="4320" w:hanging="360"/>
+      </w:pPr>
+      <w:rPr>
+        <w:rFonts w:ascii="Wingdings" w:hAnsi="Wingdings" w:hint="default"/>
+        <w:sz w:val="20"/>
+      </w:rPr>
+    </w:lvl>
+    <w:lvl w:ilvl="6" w:tentative="1">
+      <w:start w:val="1"/>
+      <w:numFmt w:val="bullet"/>
+      <w:lvlText w:val=""/>
+      <w:lvlJc w:val="left"/>
+      <w:pPr>
+        <w:tabs>
+          <w:tab w:val="num" w:pos="5040"/>
+        </w:tabs>
+        <w:ind w:left="5040" w:hanging="360"/>
+      </w:pPr>
+      <w:rPr>
+        <w:rFonts w:ascii="Wingdings" w:hAnsi="Wingdings" w:hint="default"/>
+        <w:sz w:val="20"/>
+      </w:rPr>
+    </w:lvl>
+    <w:lvl w:ilvl="7" w:tentative="1">
+      <w:start w:val="1"/>
+      <w:numFmt w:val="bullet"/>
+      <w:lvlText w:val=""/>
+      <w:lvlJc w:val="left"/>
+      <w:pPr>
+        <w:tabs>
+          <w:tab w:val="num" w:pos="5760"/>
+        </w:tabs>
+        <w:ind w:left="5760" w:hanging="360"/>
+      </w:pPr>
+      <w:rPr>
+        <w:rFonts w:ascii="Wingdings" w:hAnsi="Wingdings" w:hint="default"/>
+        <w:sz w:val="20"/>
+      </w:rPr>
+    </w:lvl>
+    <w:lvl w:ilvl="8" w:tentative="1">
+      <w:start w:val="1"/>
+      <w:numFmt w:val="bullet"/>
+      <w:lvlText w:val=""/>
+      <w:lvlJc w:val="left"/>
+      <w:pPr>
+        <w:tabs>
+          <w:tab w:val="num" w:pos="6480"/>
+        </w:tabs>
+        <w:ind w:left="6480" w:hanging="360"/>
+      </w:pPr>
+      <w:rPr>
+        <w:rFonts w:ascii="Wingdings" w:hAnsi="Wingdings" w:hint="default"/>
+        <w:sz w:val="20"/>
+      </w:rPr>
+    </w:lvl>
+  </w:abstractNum>
+  <w:abstractNum w:abstractNumId="11" w15:restartNumberingAfterBreak="0">
     <w:nsid w:val="27872077"/>
     <w:multiLevelType w:val="multilevel"/>
     <w:tmpl w:val="5C8CC6C6"/>
@@ -8927,7 +11394,7 @@
       </w:rPr>
     </w:lvl>
   </w:abstractNum>
-  <w:abstractNum w:abstractNumId="9" w15:restartNumberingAfterBreak="0">
+  <w:abstractNum w:abstractNumId="12" w15:restartNumberingAfterBreak="0">
     <w:nsid w:val="2907362F"/>
     <w:multiLevelType w:val="multilevel"/>
     <w:tmpl w:val="D6DC3718"/>
@@ -9076,7 +11543,7 @@
       </w:rPr>
     </w:lvl>
   </w:abstractNum>
-  <w:abstractNum w:abstractNumId="10" w15:restartNumberingAfterBreak="0">
+  <w:abstractNum w:abstractNumId="13" w15:restartNumberingAfterBreak="0">
     <w:nsid w:val="29FB3F32"/>
     <w:multiLevelType w:val="multilevel"/>
     <w:tmpl w:val="6524A1A4"/>
@@ -9225,7 +11692,7 @@
       </w:rPr>
     </w:lvl>
   </w:abstractNum>
-  <w:abstractNum w:abstractNumId="11" w15:restartNumberingAfterBreak="0">
+  <w:abstractNum w:abstractNumId="14" w15:restartNumberingAfterBreak="0">
     <w:nsid w:val="2B103EFF"/>
     <w:multiLevelType w:val="multilevel"/>
     <w:tmpl w:val="E6969026"/>
@@ -9374,7 +11841,7 @@
       </w:rPr>
     </w:lvl>
   </w:abstractNum>
-  <w:abstractNum w:abstractNumId="12" w15:restartNumberingAfterBreak="0">
+  <w:abstractNum w:abstractNumId="15" w15:restartNumberingAfterBreak="0">
     <w:nsid w:val="2B255A61"/>
     <w:multiLevelType w:val="multilevel"/>
     <w:tmpl w:val="119E626C"/>
@@ -9523,7 +11990,7 @@
       </w:rPr>
     </w:lvl>
   </w:abstractNum>
-  <w:abstractNum w:abstractNumId="13" w15:restartNumberingAfterBreak="0">
+  <w:abstractNum w:abstractNumId="16" w15:restartNumberingAfterBreak="0">
     <w:nsid w:val="328E28C7"/>
     <w:multiLevelType w:val="multilevel"/>
     <w:tmpl w:val="31E822B6"/>
@@ -9672,7 +12139,7 @@
       </w:rPr>
     </w:lvl>
   </w:abstractNum>
-  <w:abstractNum w:abstractNumId="14" w15:restartNumberingAfterBreak="0">
+  <w:abstractNum w:abstractNumId="17" w15:restartNumberingAfterBreak="0">
     <w:nsid w:val="33BA33F9"/>
     <w:multiLevelType w:val="multilevel"/>
     <w:tmpl w:val="121060F8"/>
@@ -9821,7 +12288,7 @@
       </w:rPr>
     </w:lvl>
   </w:abstractNum>
-  <w:abstractNum w:abstractNumId="15" w15:restartNumberingAfterBreak="0">
+  <w:abstractNum w:abstractNumId="18" w15:restartNumberingAfterBreak="0">
     <w:nsid w:val="3D453D74"/>
     <w:multiLevelType w:val="multilevel"/>
     <w:tmpl w:val="B78E3838"/>
@@ -9970,7 +12437,7 @@
       </w:rPr>
     </w:lvl>
   </w:abstractNum>
-  <w:abstractNum w:abstractNumId="16" w15:restartNumberingAfterBreak="0">
+  <w:abstractNum w:abstractNumId="19" w15:restartNumberingAfterBreak="0">
     <w:nsid w:val="41F92C70"/>
     <w:multiLevelType w:val="multilevel"/>
     <w:tmpl w:val="E9BED714"/>
@@ -10119,7 +12586,7 @@
       </w:rPr>
     </w:lvl>
   </w:abstractNum>
-  <w:abstractNum w:abstractNumId="17" w15:restartNumberingAfterBreak="0">
+  <w:abstractNum w:abstractNumId="20" w15:restartNumberingAfterBreak="0">
     <w:nsid w:val="42A73D56"/>
     <w:multiLevelType w:val="multilevel"/>
     <w:tmpl w:val="AB88EE9A"/>
@@ -10268,7 +12735,7 @@
       </w:rPr>
     </w:lvl>
   </w:abstractNum>
-  <w:abstractNum w:abstractNumId="18" w15:restartNumberingAfterBreak="0">
+  <w:abstractNum w:abstractNumId="21" w15:restartNumberingAfterBreak="0">
     <w:nsid w:val="472C294D"/>
     <w:multiLevelType w:val="multilevel"/>
     <w:tmpl w:val="6A769A58"/>
@@ -10417,7 +12884,7 @@
       </w:rPr>
     </w:lvl>
   </w:abstractNum>
-  <w:abstractNum w:abstractNumId="19" w15:restartNumberingAfterBreak="0">
+  <w:abstractNum w:abstractNumId="22" w15:restartNumberingAfterBreak="0">
     <w:nsid w:val="483D7EB4"/>
     <w:multiLevelType w:val="multilevel"/>
     <w:tmpl w:val="1DC2EDCA"/>
@@ -10566,7 +13033,156 @@
       </w:rPr>
     </w:lvl>
   </w:abstractNum>
-  <w:abstractNum w:abstractNumId="20" w15:restartNumberingAfterBreak="0">
+  <w:abstractNum w:abstractNumId="23" w15:restartNumberingAfterBreak="0">
+    <w:nsid w:val="4973753E"/>
+    <w:multiLevelType w:val="multilevel"/>
+    <w:tmpl w:val="1D64DB9C"/>
+    <w:lvl w:ilvl="0">
+      <w:start w:val="1"/>
+      <w:numFmt w:val="bullet"/>
+      <w:lvlText w:val=""/>
+      <w:lvlJc w:val="left"/>
+      <w:pPr>
+        <w:tabs>
+          <w:tab w:val="num" w:pos="720"/>
+        </w:tabs>
+        <w:ind w:left="720" w:hanging="360"/>
+      </w:pPr>
+      <w:rPr>
+        <w:rFonts w:ascii="Symbol" w:hAnsi="Symbol" w:hint="default"/>
+        <w:sz w:val="20"/>
+      </w:rPr>
+    </w:lvl>
+    <w:lvl w:ilvl="1" w:tentative="1">
+      <w:start w:val="1"/>
+      <w:numFmt w:val="bullet"/>
+      <w:lvlText w:val="o"/>
+      <w:lvlJc w:val="left"/>
+      <w:pPr>
+        <w:tabs>
+          <w:tab w:val="num" w:pos="1440"/>
+        </w:tabs>
+        <w:ind w:left="1440" w:hanging="360"/>
+      </w:pPr>
+      <w:rPr>
+        <w:rFonts w:ascii="Courier New" w:hAnsi="Courier New" w:hint="default"/>
+        <w:sz w:val="20"/>
+      </w:rPr>
+    </w:lvl>
+    <w:lvl w:ilvl="2" w:tentative="1">
+      <w:start w:val="1"/>
+      <w:numFmt w:val="bullet"/>
+      <w:lvlText w:val=""/>
+      <w:lvlJc w:val="left"/>
+      <w:pPr>
+        <w:tabs>
+          <w:tab w:val="num" w:pos="2160"/>
+        </w:tabs>
+        <w:ind w:left="2160" w:hanging="360"/>
+      </w:pPr>
+      <w:rPr>
+        <w:rFonts w:ascii="Wingdings" w:hAnsi="Wingdings" w:hint="default"/>
+        <w:sz w:val="20"/>
+      </w:rPr>
+    </w:lvl>
+    <w:lvl w:ilvl="3" w:tentative="1">
+      <w:start w:val="1"/>
+      <w:numFmt w:val="bullet"/>
+      <w:lvlText w:val=""/>
+      <w:lvlJc w:val="left"/>
+      <w:pPr>
+        <w:tabs>
+          <w:tab w:val="num" w:pos="2880"/>
+        </w:tabs>
+        <w:ind w:left="2880" w:hanging="360"/>
+      </w:pPr>
+      <w:rPr>
+        <w:rFonts w:ascii="Wingdings" w:hAnsi="Wingdings" w:hint="default"/>
+        <w:sz w:val="20"/>
+      </w:rPr>
+    </w:lvl>
+    <w:lvl w:ilvl="4" w:tentative="1">
+      <w:start w:val="1"/>
+      <w:numFmt w:val="bullet"/>
+      <w:lvlText w:val=""/>
+      <w:lvlJc w:val="left"/>
+      <w:pPr>
+        <w:tabs>
+          <w:tab w:val="num" w:pos="3600"/>
+        </w:tabs>
+        <w:ind w:left="3600" w:hanging="360"/>
+      </w:pPr>
+      <w:rPr>
+        <w:rFonts w:ascii="Wingdings" w:hAnsi="Wingdings" w:hint="default"/>
+        <w:sz w:val="20"/>
+      </w:rPr>
+    </w:lvl>
+    <w:lvl w:ilvl="5" w:tentative="1">
+      <w:start w:val="1"/>
+      <w:numFmt w:val="bullet"/>
+      <w:lvlText w:val=""/>
+      <w:lvlJc w:val="left"/>
+      <w:pPr>
+        <w:tabs>
+          <w:tab w:val="num" w:pos="4320"/>
+        </w:tabs>
+        <w:ind w:left="4320" w:hanging="360"/>
+      </w:pPr>
+      <w:rPr>
+        <w:rFonts w:ascii="Wingdings" w:hAnsi="Wingdings" w:hint="default"/>
+        <w:sz w:val="20"/>
+      </w:rPr>
+    </w:lvl>
+    <w:lvl w:ilvl="6" w:tentative="1">
+      <w:start w:val="1"/>
+      <w:numFmt w:val="bullet"/>
+      <w:lvlText w:val=""/>
+      <w:lvlJc w:val="left"/>
+      <w:pPr>
+        <w:tabs>
+          <w:tab w:val="num" w:pos="5040"/>
+        </w:tabs>
+        <w:ind w:left="5040" w:hanging="360"/>
+      </w:pPr>
+      <w:rPr>
+        <w:rFonts w:ascii="Wingdings" w:hAnsi="Wingdings" w:hint="default"/>
+        <w:sz w:val="20"/>
+      </w:rPr>
+    </w:lvl>
+    <w:lvl w:ilvl="7" w:tentative="1">
+      <w:start w:val="1"/>
+      <w:numFmt w:val="bullet"/>
+      <w:lvlText w:val=""/>
+      <w:lvlJc w:val="left"/>
+      <w:pPr>
+        <w:tabs>
+          <w:tab w:val="num" w:pos="5760"/>
+        </w:tabs>
+        <w:ind w:left="5760" w:hanging="360"/>
+      </w:pPr>
+      <w:rPr>
+        <w:rFonts w:ascii="Wingdings" w:hAnsi="Wingdings" w:hint="default"/>
+        <w:sz w:val="20"/>
+      </w:rPr>
+    </w:lvl>
+    <w:lvl w:ilvl="8" w:tentative="1">
+      <w:start w:val="1"/>
+      <w:numFmt w:val="bullet"/>
+      <w:lvlText w:val=""/>
+      <w:lvlJc w:val="left"/>
+      <w:pPr>
+        <w:tabs>
+          <w:tab w:val="num" w:pos="6480"/>
+        </w:tabs>
+        <w:ind w:left="6480" w:hanging="360"/>
+      </w:pPr>
+      <w:rPr>
+        <w:rFonts w:ascii="Wingdings" w:hAnsi="Wingdings" w:hint="default"/>
+        <w:sz w:val="20"/>
+      </w:rPr>
+    </w:lvl>
+  </w:abstractNum>
+  <w:abstractNum w:abstractNumId="24" w15:restartNumberingAfterBreak="0">
     <w:nsid w:val="4AA13ECC"/>
     <w:multiLevelType w:val="multilevel"/>
     <w:tmpl w:val="9E883880"/>
@@ -10715,7 +13331,7 @@
       </w:rPr>
     </w:lvl>
   </w:abstractNum>
-  <w:abstractNum w:abstractNumId="21" w15:restartNumberingAfterBreak="0">
+  <w:abstractNum w:abstractNumId="25" w15:restartNumberingAfterBreak="0">
     <w:nsid w:val="4F165417"/>
     <w:multiLevelType w:val="multilevel"/>
     <w:tmpl w:val="64E8A1AA"/>
@@ -10864,7 +13480,7 @@
       </w:rPr>
     </w:lvl>
   </w:abstractNum>
-  <w:abstractNum w:abstractNumId="22" w15:restartNumberingAfterBreak="0">
+  <w:abstractNum w:abstractNumId="26" w15:restartNumberingAfterBreak="0">
     <w:nsid w:val="51C83EF5"/>
     <w:multiLevelType w:val="multilevel"/>
     <w:tmpl w:val="FBCA233C"/>
@@ -11013,7 +13629,7 @@
       </w:rPr>
     </w:lvl>
   </w:abstractNum>
-  <w:abstractNum w:abstractNumId="23" w15:restartNumberingAfterBreak="0">
+  <w:abstractNum w:abstractNumId="27" w15:restartNumberingAfterBreak="0">
     <w:nsid w:val="56E42F00"/>
     <w:multiLevelType w:val="multilevel"/>
     <w:tmpl w:val="B980DDE0"/>
@@ -11162,7 +13778,7 @@
       </w:rPr>
     </w:lvl>
   </w:abstractNum>
-  <w:abstractNum w:abstractNumId="24" w15:restartNumberingAfterBreak="0">
+  <w:abstractNum w:abstractNumId="28" w15:restartNumberingAfterBreak="0">
     <w:nsid w:val="574A097E"/>
     <w:multiLevelType w:val="multilevel"/>
     <w:tmpl w:val="C81EE0BA"/>
@@ -11311,7 +13927,7 @@
       </w:rPr>
     </w:lvl>
   </w:abstractNum>
-  <w:abstractNum w:abstractNumId="25" w15:restartNumberingAfterBreak="0">
+  <w:abstractNum w:abstractNumId="29" w15:restartNumberingAfterBreak="0">
     <w:nsid w:val="583F35F9"/>
     <w:multiLevelType w:val="multilevel"/>
     <w:tmpl w:val="AC40A6AA"/>
@@ -11424,7 +14040,7 @@
       </w:pPr>
     </w:lvl>
   </w:abstractNum>
-  <w:abstractNum w:abstractNumId="26" w15:restartNumberingAfterBreak="0">
+  <w:abstractNum w:abstractNumId="30" w15:restartNumberingAfterBreak="0">
     <w:nsid w:val="5F8C4411"/>
     <w:multiLevelType w:val="multilevel"/>
     <w:tmpl w:val="1766EE28"/>
@@ -11573,7 +14189,305 @@
       </w:rPr>
     </w:lvl>
   </w:abstractNum>
-  <w:abstractNum w:abstractNumId="27" w15:restartNumberingAfterBreak="0">
+  <w:abstractNum w:abstractNumId="31" w15:restartNumberingAfterBreak="0">
+    <w:nsid w:val="5FE17564"/>
+    <w:multiLevelType w:val="multilevel"/>
+    <w:tmpl w:val="ABB84B44"/>
+    <w:lvl w:ilvl="0">
+      <w:start w:val="1"/>
+      <w:numFmt w:val="bullet"/>
+      <w:lvlText w:val=""/>
+      <w:lvlJc w:val="left"/>
+      <w:pPr>
+        <w:tabs>
+          <w:tab w:val="num" w:pos="720"/>
+        </w:tabs>
+        <w:ind w:left="720" w:hanging="360"/>
+      </w:pPr>
+      <w:rPr>
+        <w:rFonts w:ascii="Symbol" w:hAnsi="Symbol" w:hint="default"/>
+        <w:sz w:val="20"/>
+      </w:rPr>
+    </w:lvl>
+    <w:lvl w:ilvl="1" w:tentative="1">
+      <w:start w:val="1"/>
+      <w:numFmt w:val="bullet"/>
+      <w:lvlText w:val="o"/>
+      <w:lvlJc w:val="left"/>
+      <w:pPr>
+        <w:tabs>
+          <w:tab w:val="num" w:pos="1440"/>
+        </w:tabs>
+        <w:ind w:left="1440" w:hanging="360"/>
+      </w:pPr>
+      <w:rPr>
+        <w:rFonts w:ascii="Courier New" w:hAnsi="Courier New" w:hint="default"/>
+        <w:sz w:val="20"/>
+      </w:rPr>
+    </w:lvl>
+    <w:lvl w:ilvl="2" w:tentative="1">
+      <w:start w:val="1"/>
+      <w:numFmt w:val="bullet"/>
+      <w:lvlText w:val=""/>
+      <w:lvlJc w:val="left"/>
+      <w:pPr>
+        <w:tabs>
+          <w:tab w:val="num" w:pos="2160"/>
+        </w:tabs>
+        <w:ind w:left="2160" w:hanging="360"/>
+      </w:pPr>
+      <w:rPr>
+        <w:rFonts w:ascii="Wingdings" w:hAnsi="Wingdings" w:hint="default"/>
+        <w:sz w:val="20"/>
+      </w:rPr>
+    </w:lvl>
+    <w:lvl w:ilvl="3" w:tentative="1">
+      <w:start w:val="1"/>
+      <w:numFmt w:val="bullet"/>
+      <w:lvlText w:val=""/>
+      <w:lvlJc w:val="left"/>
+      <w:pPr>
+        <w:tabs>
+          <w:tab w:val="num" w:pos="2880"/>
+        </w:tabs>
+        <w:ind w:left="2880" w:hanging="360"/>
+      </w:pPr>
+      <w:rPr>
+        <w:rFonts w:ascii="Wingdings" w:hAnsi="Wingdings" w:hint="default"/>
+        <w:sz w:val="20"/>
+      </w:rPr>
+    </w:lvl>
+    <w:lvl w:ilvl="4" w:tentative="1">
+      <w:start w:val="1"/>
+      <w:numFmt w:val="bullet"/>
+      <w:lvlText w:val=""/>
+      <w:lvlJc w:val="left"/>
+      <w:pPr>
+        <w:tabs>
+          <w:tab w:val="num" w:pos="3600"/>
+        </w:tabs>
+        <w:ind w:left="3600" w:hanging="360"/>
+      </w:pPr>
+      <w:rPr>
+        <w:rFonts w:ascii="Wingdings" w:hAnsi="Wingdings" w:hint="default"/>
+        <w:sz w:val="20"/>
+      </w:rPr>
+    </w:lvl>
+    <w:lvl w:ilvl="5" w:tentative="1">
+      <w:start w:val="1"/>
+      <w:numFmt w:val="bullet"/>
+      <w:lvlText w:val=""/>
+      <w:lvlJc w:val="left"/>
+      <w:pPr>
+        <w:tabs>
+          <w:tab w:val="num" w:pos="4320"/>
+        </w:tabs>
+        <w:ind w:left="4320" w:hanging="360"/>
+      </w:pPr>
+      <w:rPr>
+        <w:rFonts w:ascii="Wingdings" w:hAnsi="Wingdings" w:hint="default"/>
+        <w:sz w:val="20"/>
+      </w:rPr>
+    </w:lvl>
+    <w:lvl w:ilvl="6" w:tentative="1">
+      <w:start w:val="1"/>
+      <w:numFmt w:val="bullet"/>
+      <w:lvlText w:val=""/>
+      <w:lvlJc w:val="left"/>
+      <w:pPr>
+        <w:tabs>
+          <w:tab w:val="num" w:pos="5040"/>
+        </w:tabs>
+        <w:ind w:left="5040" w:hanging="360"/>
+      </w:pPr>
+      <w:rPr>
+        <w:rFonts w:ascii="Wingdings" w:hAnsi="Wingdings" w:hint="default"/>
+        <w:sz w:val="20"/>
+      </w:rPr>
+    </w:lvl>
+    <w:lvl w:ilvl="7" w:tentative="1">
+      <w:start w:val="1"/>
+      <w:numFmt w:val="bullet"/>
+      <w:lvlText w:val=""/>
+      <w:lvlJc w:val="left"/>
+      <w:pPr>
+        <w:tabs>
+          <w:tab w:val="num" w:pos="5760"/>
+        </w:tabs>
+        <w:ind w:left="5760" w:hanging="360"/>
+      </w:pPr>
+      <w:rPr>
+        <w:rFonts w:ascii="Wingdings" w:hAnsi="Wingdings" w:hint="default"/>
+        <w:sz w:val="20"/>
+      </w:rPr>
+    </w:lvl>
+    <w:lvl w:ilvl="8" w:tentative="1">
+      <w:start w:val="1"/>
+      <w:numFmt w:val="bullet"/>
+      <w:lvlText w:val=""/>
+      <w:lvlJc w:val="left"/>
+      <w:pPr>
+        <w:tabs>
+          <w:tab w:val="num" w:pos="6480"/>
+        </w:tabs>
+        <w:ind w:left="6480" w:hanging="360"/>
+      </w:pPr>
+      <w:rPr>
+        <w:rFonts w:ascii="Wingdings" w:hAnsi="Wingdings" w:hint="default"/>
+        <w:sz w:val="20"/>
+      </w:rPr>
+    </w:lvl>
+  </w:abstractNum>
+  <w:abstractNum w:abstractNumId="32" w15:restartNumberingAfterBreak="0">
+    <w:nsid w:val="63EA45EF"/>
+    <w:multiLevelType w:val="multilevel"/>
+    <w:tmpl w:val="4C28062C"/>
+    <w:lvl w:ilvl="0">
+      <w:start w:val="1"/>
+      <w:numFmt w:val="bullet"/>
+      <w:lvlText w:val=""/>
+      <w:lvlJc w:val="left"/>
+      <w:pPr>
+        <w:tabs>
+          <w:tab w:val="num" w:pos="720"/>
+        </w:tabs>
+        <w:ind w:left="720" w:hanging="360"/>
+      </w:pPr>
+      <w:rPr>
+        <w:rFonts w:ascii="Symbol" w:hAnsi="Symbol" w:hint="default"/>
+        <w:sz w:val="20"/>
+      </w:rPr>
+    </w:lvl>
+    <w:lvl w:ilvl="1" w:tentative="1">
+      <w:start w:val="1"/>
+      <w:numFmt w:val="bullet"/>
+      <w:lvlText w:val="o"/>
+      <w:lvlJc w:val="left"/>
+      <w:pPr>
+        <w:tabs>
+          <w:tab w:val="num" w:pos="1440"/>
+        </w:tabs>
+        <w:ind w:left="1440" w:hanging="360"/>
+      </w:pPr>
+      <w:rPr>
+        <w:rFonts w:ascii="Courier New" w:hAnsi="Courier New" w:hint="default"/>
+        <w:sz w:val="20"/>
+      </w:rPr>
+    </w:lvl>
+    <w:lvl w:ilvl="2" w:tentative="1">
+      <w:start w:val="1"/>
+      <w:numFmt w:val="bullet"/>
+      <w:lvlText w:val=""/>
+      <w:lvlJc w:val="left"/>
+      <w:pPr>
+        <w:tabs>
+          <w:tab w:val="num" w:pos="2160"/>
+        </w:tabs>
+        <w:ind w:left="2160" w:hanging="360"/>
+      </w:pPr>
+      <w:rPr>
+        <w:rFonts w:ascii="Wingdings" w:hAnsi="Wingdings" w:hint="default"/>
+        <w:sz w:val="20"/>
+      </w:rPr>
+    </w:lvl>
+    <w:lvl w:ilvl="3" w:tentative="1">
+      <w:start w:val="1"/>
+      <w:numFmt w:val="bullet"/>
+      <w:lvlText w:val=""/>
+      <w:lvlJc w:val="left"/>
+      <w:pPr>
+        <w:tabs>
+          <w:tab w:val="num" w:pos="2880"/>
+        </w:tabs>
+        <w:ind w:left="2880" w:hanging="360"/>
+      </w:pPr>
+      <w:rPr>
+        <w:rFonts w:ascii="Wingdings" w:hAnsi="Wingdings" w:hint="default"/>
+        <w:sz w:val="20"/>
+      </w:rPr>
+    </w:lvl>
+    <w:lvl w:ilvl="4" w:tentative="1">
+      <w:start w:val="1"/>
+      <w:numFmt w:val="bullet"/>
+      <w:lvlText w:val=""/>
+      <w:lvlJc w:val="left"/>
+      <w:pPr>
+        <w:tabs>
+          <w:tab w:val="num" w:pos="3600"/>
+        </w:tabs>
+        <w:ind w:left="3600" w:hanging="360"/>
+      </w:pPr>
+      <w:rPr>
+        <w:rFonts w:ascii="Wingdings" w:hAnsi="Wingdings" w:hint="default"/>
+        <w:sz w:val="20"/>
+      </w:rPr>
+    </w:lvl>
+    <w:lvl w:ilvl="5" w:tentative="1">
+      <w:start w:val="1"/>
+      <w:numFmt w:val="bullet"/>
+      <w:lvlText w:val=""/>
+      <w:lvlJc w:val="left"/>
+      <w:pPr>
+        <w:tabs>
+          <w:tab w:val="num" w:pos="4320"/>
+        </w:tabs>
+        <w:ind w:left="4320" w:hanging="360"/>
+      </w:pPr>
+      <w:rPr>
+        <w:rFonts w:ascii="Wingdings" w:hAnsi="Wingdings" w:hint="default"/>
+        <w:sz w:val="20"/>
+      </w:rPr>
+    </w:lvl>
+    <w:lvl w:ilvl="6" w:tentative="1">
+      <w:start w:val="1"/>
+      <w:numFmt w:val="bullet"/>
+      <w:lvlText w:val=""/>
+      <w:lvlJc w:val="left"/>
+      <w:pPr>
+        <w:tabs>
+          <w:tab w:val="num" w:pos="5040"/>
+        </w:tabs>
+        <w:ind w:left="5040" w:hanging="360"/>
+      </w:pPr>
+      <w:rPr>
+        <w:rFonts w:ascii="Wingdings" w:hAnsi="Wingdings" w:hint="default"/>
+        <w:sz w:val="20"/>
+      </w:rPr>
+    </w:lvl>
+    <w:lvl w:ilvl="7" w:tentative="1">
+      <w:start w:val="1"/>
+      <w:numFmt w:val="bullet"/>
+      <w:lvlText w:val=""/>
+      <w:lvlJc w:val="left"/>
+      <w:pPr>
+        <w:tabs>
+          <w:tab w:val="num" w:pos="5760"/>
+        </w:tabs>
+        <w:ind w:left="5760" w:hanging="360"/>
+      </w:pPr>
+      <w:rPr>
+        <w:rFonts w:ascii="Wingdings" w:hAnsi="Wingdings" w:hint="default"/>
+        <w:sz w:val="20"/>
+      </w:rPr>
+    </w:lvl>
+    <w:lvl w:ilvl="8" w:tentative="1">
+      <w:start w:val="1"/>
+      <w:numFmt w:val="bullet"/>
+      <w:lvlText w:val=""/>
+      <w:lvlJc w:val="left"/>
+      <w:pPr>
+        <w:tabs>
+          <w:tab w:val="num" w:pos="6480"/>
+        </w:tabs>
+        <w:ind w:left="6480" w:hanging="360"/>
+      </w:pPr>
+      <w:rPr>
+        <w:rFonts w:ascii="Wingdings" w:hAnsi="Wingdings" w:hint="default"/>
+        <w:sz w:val="20"/>
+      </w:rPr>
+    </w:lvl>
+  </w:abstractNum>
+  <w:abstractNum w:abstractNumId="33" w15:restartNumberingAfterBreak="0">
     <w:nsid w:val="653C0999"/>
     <w:multiLevelType w:val="multilevel"/>
     <w:tmpl w:val="C7D6D552"/>
@@ -11722,7 +14636,7 @@
       </w:rPr>
     </w:lvl>
   </w:abstractNum>
-  <w:abstractNum w:abstractNumId="28" w15:restartNumberingAfterBreak="0">
+  <w:abstractNum w:abstractNumId="34" w15:restartNumberingAfterBreak="0">
     <w:nsid w:val="65792D95"/>
     <w:multiLevelType w:val="multilevel"/>
     <w:tmpl w:val="C9C06098"/>
@@ -11871,7 +14785,7 @@
       </w:rPr>
     </w:lvl>
   </w:abstractNum>
-  <w:abstractNum w:abstractNumId="29" w15:restartNumberingAfterBreak="0">
+  <w:abstractNum w:abstractNumId="35" w15:restartNumberingAfterBreak="0">
     <w:nsid w:val="699D7975"/>
     <w:multiLevelType w:val="multilevel"/>
     <w:tmpl w:val="A94084DC"/>
@@ -12020,7 +14934,7 @@
       </w:rPr>
     </w:lvl>
   </w:abstractNum>
-  <w:abstractNum w:abstractNumId="30" w15:restartNumberingAfterBreak="0">
+  <w:abstractNum w:abstractNumId="36" w15:restartNumberingAfterBreak="0">
     <w:nsid w:val="715F1056"/>
     <w:multiLevelType w:val="multilevel"/>
     <w:tmpl w:val="B4AEEC08"/>
@@ -12133,7 +15047,7 @@
       </w:pPr>
     </w:lvl>
   </w:abstractNum>
-  <w:abstractNum w:abstractNumId="31" w15:restartNumberingAfterBreak="0">
+  <w:abstractNum w:abstractNumId="37" w15:restartNumberingAfterBreak="0">
     <w:nsid w:val="7EA834EE"/>
     <w:multiLevelType w:val="multilevel"/>
     <w:tmpl w:val="B9C8C5CE"/>
@@ -12282,7 +15196,7 @@
       </w:rPr>
     </w:lvl>
   </w:abstractNum>
-  <w:abstractNum w:abstractNumId="32" w15:restartNumberingAfterBreak="0">
+  <w:abstractNum w:abstractNumId="38" w15:restartNumberingAfterBreak="0">
     <w:nsid w:val="7EE44B4C"/>
     <w:multiLevelType w:val="multilevel"/>
     <w:tmpl w:val="B7DCE6EA"/>
@@ -12432,40 +15346,40 @@
     </w:lvl>
   </w:abstractNum>
   <w:num w:numId="1" w16cid:durableId="1227300177">
-    <w:abstractNumId w:val="14"/>
+    <w:abstractNumId w:val="17"/>
   </w:num>
   <w:num w:numId="2" w16cid:durableId="1965260687">
-    <w:abstractNumId w:val="31"/>
+    <w:abstractNumId w:val="37"/>
   </w:num>
   <w:num w:numId="3" w16cid:durableId="815729120">
-    <w:abstractNumId w:val="3"/>
+    <w:abstractNumId w:val="4"/>
   </w:num>
   <w:num w:numId="4" w16cid:durableId="942613649">
-    <w:abstractNumId w:val="30"/>
+    <w:abstractNumId w:val="36"/>
   </w:num>
   <w:num w:numId="5" w16cid:durableId="2064333567">
-    <w:abstractNumId w:val="20"/>
+    <w:abstractNumId w:val="24"/>
   </w:num>
   <w:num w:numId="6" w16cid:durableId="1908031268">
-    <w:abstractNumId w:val="9"/>
+    <w:abstractNumId w:val="12"/>
   </w:num>
   <w:num w:numId="7" w16cid:durableId="1948343680">
-    <w:abstractNumId w:val="19"/>
+    <w:abstractNumId w:val="22"/>
   </w:num>
   <w:num w:numId="8" w16cid:durableId="1133790760">
-    <w:abstractNumId w:val="10"/>
+    <w:abstractNumId w:val="13"/>
   </w:num>
   <w:num w:numId="9" w16cid:durableId="781150427">
-    <w:abstractNumId w:val="12"/>
+    <w:abstractNumId w:val="15"/>
   </w:num>
   <w:num w:numId="10" w16cid:durableId="1186989759">
-    <w:abstractNumId w:val="29"/>
+    <w:abstractNumId w:val="35"/>
   </w:num>
   <w:num w:numId="11" w16cid:durableId="1686662956">
-    <w:abstractNumId w:val="18"/>
+    <w:abstractNumId w:val="21"/>
   </w:num>
   <w:num w:numId="12" w16cid:durableId="1964339899">
-    <w:abstractNumId w:val="13"/>
+    <w:abstractNumId w:val="16"/>
   </w:num>
   <w:num w:numId="13" w16cid:durableId="1510409766">
     <w:abstractNumId w:val="2"/>
@@ -12474,61 +15388,79 @@
     <w:abstractNumId w:val="0"/>
   </w:num>
   <w:num w:numId="15" w16cid:durableId="770247194">
-    <w:abstractNumId w:val="7"/>
+    <w:abstractNumId w:val="9"/>
   </w:num>
   <w:num w:numId="16" w16cid:durableId="1579753841">
-    <w:abstractNumId w:val="16"/>
+    <w:abstractNumId w:val="19"/>
   </w:num>
   <w:num w:numId="17" w16cid:durableId="712194579">
+    <w:abstractNumId w:val="29"/>
+  </w:num>
+  <w:num w:numId="18" w16cid:durableId="2128422922">
+    <w:abstractNumId w:val="34"/>
+  </w:num>
+  <w:num w:numId="19" w16cid:durableId="99614843">
+    <w:abstractNumId w:val="26"/>
+  </w:num>
+  <w:num w:numId="20" w16cid:durableId="1221408560">
+    <w:abstractNumId w:val="14"/>
+  </w:num>
+  <w:num w:numId="21" w16cid:durableId="2098673077">
+    <w:abstractNumId w:val="30"/>
+  </w:num>
+  <w:num w:numId="22" w16cid:durableId="837306612">
+    <w:abstractNumId w:val="6"/>
+  </w:num>
+  <w:num w:numId="23" w16cid:durableId="34276977">
+    <w:abstractNumId w:val="18"/>
+  </w:num>
+  <w:num w:numId="24" w16cid:durableId="735396779">
+    <w:abstractNumId w:val="27"/>
+  </w:num>
+  <w:num w:numId="25" w16cid:durableId="1134761773">
+    <w:abstractNumId w:val="8"/>
+  </w:num>
+  <w:num w:numId="26" w16cid:durableId="148012942">
+    <w:abstractNumId w:val="11"/>
+  </w:num>
+  <w:num w:numId="27" w16cid:durableId="665133554">
+    <w:abstractNumId w:val="33"/>
+  </w:num>
+  <w:num w:numId="28" w16cid:durableId="755327094">
+    <w:abstractNumId w:val="38"/>
+  </w:num>
+  <w:num w:numId="29" w16cid:durableId="1889030908">
+    <w:abstractNumId w:val="28"/>
+  </w:num>
+  <w:num w:numId="30" w16cid:durableId="386800936">
+    <w:abstractNumId w:val="20"/>
+  </w:num>
+  <w:num w:numId="31" w16cid:durableId="822896249">
     <w:abstractNumId w:val="25"/>
   </w:num>
-  <w:num w:numId="18" w16cid:durableId="2128422922">
-    <w:abstractNumId w:val="28"/>
-  </w:num>
-  <w:num w:numId="19" w16cid:durableId="99614843">
-    <w:abstractNumId w:val="22"/>
-  </w:num>
-  <w:num w:numId="20" w16cid:durableId="1221408560">
-    <w:abstractNumId w:val="11"/>
-  </w:num>
-  <w:num w:numId="21" w16cid:durableId="2098673077">
-    <w:abstractNumId w:val="26"/>
-  </w:num>
-  <w:num w:numId="22" w16cid:durableId="837306612">
-    <w:abstractNumId w:val="4"/>
-  </w:num>
-  <w:num w:numId="23" w16cid:durableId="34276977">
-    <w:abstractNumId w:val="15"/>
-  </w:num>
-  <w:num w:numId="24" w16cid:durableId="735396779">
-    <w:abstractNumId w:val="23"/>
-  </w:num>
-  <w:num w:numId="25" w16cid:durableId="1134761773">
-    <w:abstractNumId w:val="6"/>
-  </w:num>
-  <w:num w:numId="26" w16cid:durableId="148012942">
-    <w:abstractNumId w:val="8"/>
-  </w:num>
-  <w:num w:numId="27" w16cid:durableId="665133554">
-    <w:abstractNumId w:val="27"/>
-  </w:num>
-  <w:num w:numId="28" w16cid:durableId="755327094">
-    <w:abstractNumId w:val="32"/>
-  </w:num>
-  <w:num w:numId="29" w16cid:durableId="1889030908">
-    <w:abstractNumId w:val="24"/>
-  </w:num>
-  <w:num w:numId="30" w16cid:durableId="386800936">
-    <w:abstractNumId w:val="17"/>
-  </w:num>
-  <w:num w:numId="31" w16cid:durableId="822896249">
-    <w:abstractNumId w:val="21"/>
-  </w:num>
   <w:num w:numId="32" w16cid:durableId="1658806628">
-    <w:abstractNumId w:val="5"/>
+    <w:abstractNumId w:val="7"/>
   </w:num>
   <w:num w:numId="33" w16cid:durableId="1343629450">
     <w:abstractNumId w:val="1"/>
+  </w:num>
+  <w:num w:numId="34" w16cid:durableId="661853667">
+    <w:abstractNumId w:val="10"/>
+  </w:num>
+  <w:num w:numId="35" w16cid:durableId="198779780">
+    <w:abstractNumId w:val="32"/>
+  </w:num>
+  <w:num w:numId="36" w16cid:durableId="1324624234">
+    <w:abstractNumId w:val="23"/>
+  </w:num>
+  <w:num w:numId="37" w16cid:durableId="1587614971">
+    <w:abstractNumId w:val="5"/>
+  </w:num>
+  <w:num w:numId="38" w16cid:durableId="581648954">
+    <w:abstractNumId w:val="3"/>
+  </w:num>
+  <w:num w:numId="39" w16cid:durableId="1592467082">
+    <w:abstractNumId w:val="31"/>
   </w:num>
 </w:numbering>
 </file>

</xml_diff>